<commit_message>
docs: hire-purchase contract uses ฿16,000 down payment (total ฿62,800)
Co-Authored-By: Claude Opus 5.5 <noreply@anthropic.com>
Claude-Session: https://claude.ai/code/session_01JgxTQRAtuSbhFJ3Hyi5Qsm
</commit_message>
<xml_diff>
--- a/docs/contracts/สัญญาเช่าซื้อ-AED-Y8.docx
+++ b/docs/contracts/สัญญาเช่าซื้อ-AED-Y8.docx
@@ -783,7 +783,7 @@
           <w:sz w:val="32"/>
           <w:szCs w:val="32"/>
         </w:rPr>
-        <w:t xml:space="preserve">ราคาเช่าซื้อทั้งสิ้น 52,000.00 บาท (ห้าหมื่นสองพันบาทถ้วน) ยังไม่รวมภาษีมูลค่าเพิ่ม ผู้เช่าซื้อตกลงชำระดังนี้</w:t>
+        <w:t xml:space="preserve">ราคาเช่าซื้อทั้งสิ้น 62,800.00 บาท (หกหมื่นสองพันแปดร้อยบาทถ้วน) ยังไม่รวมภาษีมูลค่าเพิ่ม ผู้เช่าซื้อตกลงชำระดังนี้</w:t>
       </w:r>
     </w:p>
     <w:p>
@@ -808,7 +808,7 @@
           <w:sz w:val="32"/>
           <w:szCs w:val="32"/>
         </w:rPr>
-        <w:t xml:space="preserve">(ก) เงินมัดจำ 5,200.00 บาท ชำระในวันทำสัญญา และให้ถือเป็นส่วนหนึ่งของราคาเช่าซื้อ</w:t>
+        <w:t xml:space="preserve">(ก) เงินมัดจำ 16,000.00 บาท ชำระในวันทำสัญญา และให้ถือเป็นส่วนหนึ่งของราคาเช่าซื้อ</w:t>
       </w:r>
     </w:p>
     <w:p>
@@ -2244,7 +2244,7 @@
                 <w:sz w:val="30"/>
                 <w:szCs w:val="30"/>
               </w:rPr>
-              <w:t xml:space="preserve">5,200.00</w:t>
+              <w:t xml:space="preserve">16,000.00</w:t>
             </w:r>
           </w:p>
         </w:tc>
@@ -2276,7 +2276,7 @@
                 <w:sz w:val="30"/>
                 <w:szCs w:val="30"/>
               </w:rPr>
-              <w:t xml:space="preserve">364.00</w:t>
+              <w:t xml:space="preserve">1,120.00</w:t>
             </w:r>
           </w:p>
         </w:tc>
@@ -2308,7 +2308,7 @@
                 <w:sz w:val="30"/>
                 <w:szCs w:val="30"/>
               </w:rPr>
-              <w:t xml:space="preserve">5,564.00</w:t>
+              <w:t xml:space="preserve">17,120.00</w:t>
             </w:r>
           </w:p>
         </w:tc>
@@ -5379,7 +5379,7 @@
                 <w:sz w:val="30"/>
                 <w:szCs w:val="30"/>
               </w:rPr>
-              <w:t xml:space="preserve">52,000.00</w:t>
+              <w:t xml:space="preserve">62,800.00</w:t>
             </w:r>
           </w:p>
         </w:tc>
@@ -5411,7 +5411,7 @@
                 <w:sz w:val="30"/>
                 <w:szCs w:val="30"/>
               </w:rPr>
-              <w:t xml:space="preserve">3,640.00</w:t>
+              <w:t xml:space="preserve">4,396.00</w:t>
             </w:r>
           </w:p>
         </w:tc>
@@ -5443,7 +5443,7 @@
                 <w:sz w:val="30"/>
                 <w:szCs w:val="30"/>
               </w:rPr>
-              <w:t xml:space="preserve">55,640.00</w:t>
+              <w:t xml:space="preserve">67,196.00</w:t>
             </w:r>
           </w:p>
         </w:tc>
@@ -5463,7 +5463,7 @@
           <w:sz w:val="28"/>
           <w:szCs w:val="28"/>
         </w:rPr>
-        <w:t xml:space="preserve">หมายเหตุผู้ร่าง: ตารางนี้คิด VAT 7% เพิ่มจากราคา ฿52,000 ตามโฆษณาที่ระบุ "ก่อน VAT" หากราคาบนเว็บรวม VAT แล้ว ให้แก้ข้อ 2 และตารางนี้</w:t>
+        <w:t xml:space="preserve">หมายเหตุผู้ร่าง: ตารางนี้คิด VAT 7% เพิ่มจากราคา ฿62,800 ตามโฆษณาที่ระบุ "ก่อน VAT" หากราคาบนเว็บรวม VAT แล้ว ให้แก้ข้อ 2 และตารางนี้</w:t>
       </w:r>
     </w:p>
     <w:p>

</xml_diff>

<commit_message>
docs: contract terms ฿16,000 down + ฿2,000 × 18 (total ฿52,000)
Co-Authored-By: Claude Opus 5.5 <noreply@anthropic.com>
Claude-Session: https://claude.ai/code/session_01JgxTQRAtuSbhFJ3Hyi5Qsm
</commit_message>
<xml_diff>
--- a/docs/contracts/สัญญาเช่าซื้อ-AED-Y8.docx
+++ b/docs/contracts/สัญญาเช่าซื้อ-AED-Y8.docx
@@ -783,7 +783,7 @@
           <w:sz w:val="32"/>
           <w:szCs w:val="32"/>
         </w:rPr>
-        <w:t xml:space="preserve">ราคาเช่าซื้อทั้งสิ้น 62,800.00 บาท (หกหมื่นสองพันแปดร้อยบาทถ้วน) ยังไม่รวมภาษีมูลค่าเพิ่ม ผู้เช่าซื้อตกลงชำระดังนี้</w:t>
+        <w:t xml:space="preserve">ราคาเช่าซื้อทั้งสิ้น 52,000.00 บาท (ห้าหมื่นสองพันบาทถ้วน) ยังไม่รวมภาษีมูลค่าเพิ่ม ผู้เช่าซื้อตกลงชำระดังนี้</w:t>
       </w:r>
     </w:p>
     <w:p>
@@ -833,7 +833,7 @@
           <w:sz w:val="32"/>
           <w:szCs w:val="32"/>
         </w:rPr>
-        <w:t xml:space="preserve">(ข) ค่าเช่าซื้อรายเดือน 18 งวด งวดละ 2,600.00 บาท ชำระภายในวันที่ ______ ของทุกเดือน เริ่มงวดแรกวันที่ ______________ และงวดสุดท้ายวันที่ ______________ ตามตารางการชำระเงินในเอกสารแนบ 1</w:t>
+        <w:t xml:space="preserve">(ข) ค่าเช่าซื้อรายเดือน 18 งวด งวดละ 2,000.00 บาท ชำระภายในวันที่ ______ ของทุกเดือน เริ่มงวดแรกวันที่ ______________ และงวดสุดท้ายวันที่ ______________ ตามตารางการชำระเงินในเอกสารแนบ 1</w:t>
       </w:r>
     </w:p>
     <w:p>
@@ -2409,7 +2409,7 @@
                 <w:sz w:val="30"/>
                 <w:szCs w:val="30"/>
               </w:rPr>
-              <w:t xml:space="preserve">2,600.00</w:t>
+              <w:t xml:space="preserve">2,000.00</w:t>
             </w:r>
           </w:p>
         </w:tc>
@@ -2441,7 +2441,7 @@
                 <w:sz w:val="30"/>
                 <w:szCs w:val="30"/>
               </w:rPr>
-              <w:t xml:space="preserve">182.00</w:t>
+              <w:t xml:space="preserve">140.00</w:t>
             </w:r>
           </w:p>
         </w:tc>
@@ -2473,7 +2473,7 @@
                 <w:sz w:val="30"/>
                 <w:szCs w:val="30"/>
               </w:rPr>
-              <w:t xml:space="preserve">2,782.00</w:t>
+              <w:t xml:space="preserve">2,140.00</w:t>
             </w:r>
           </w:p>
         </w:tc>
@@ -2574,7 +2574,7 @@
                 <w:sz w:val="30"/>
                 <w:szCs w:val="30"/>
               </w:rPr>
-              <w:t xml:space="preserve">2,600.00</w:t>
+              <w:t xml:space="preserve">2,000.00</w:t>
             </w:r>
           </w:p>
         </w:tc>
@@ -2606,7 +2606,7 @@
                 <w:sz w:val="30"/>
                 <w:szCs w:val="30"/>
               </w:rPr>
-              <w:t xml:space="preserve">182.00</w:t>
+              <w:t xml:space="preserve">140.00</w:t>
             </w:r>
           </w:p>
         </w:tc>
@@ -2638,7 +2638,7 @@
                 <w:sz w:val="30"/>
                 <w:szCs w:val="30"/>
               </w:rPr>
-              <w:t xml:space="preserve">2,782.00</w:t>
+              <w:t xml:space="preserve">2,140.00</w:t>
             </w:r>
           </w:p>
         </w:tc>
@@ -2739,7 +2739,7 @@
                 <w:sz w:val="30"/>
                 <w:szCs w:val="30"/>
               </w:rPr>
-              <w:t xml:space="preserve">2,600.00</w:t>
+              <w:t xml:space="preserve">2,000.00</w:t>
             </w:r>
           </w:p>
         </w:tc>
@@ -2771,7 +2771,7 @@
                 <w:sz w:val="30"/>
                 <w:szCs w:val="30"/>
               </w:rPr>
-              <w:t xml:space="preserve">182.00</w:t>
+              <w:t xml:space="preserve">140.00</w:t>
             </w:r>
           </w:p>
         </w:tc>
@@ -2803,7 +2803,7 @@
                 <w:sz w:val="30"/>
                 <w:szCs w:val="30"/>
               </w:rPr>
-              <w:t xml:space="preserve">2,782.00</w:t>
+              <w:t xml:space="preserve">2,140.00</w:t>
             </w:r>
           </w:p>
         </w:tc>
@@ -2904,7 +2904,7 @@
                 <w:sz w:val="30"/>
                 <w:szCs w:val="30"/>
               </w:rPr>
-              <w:t xml:space="preserve">2,600.00</w:t>
+              <w:t xml:space="preserve">2,000.00</w:t>
             </w:r>
           </w:p>
         </w:tc>
@@ -2936,7 +2936,7 @@
                 <w:sz w:val="30"/>
                 <w:szCs w:val="30"/>
               </w:rPr>
-              <w:t xml:space="preserve">182.00</w:t>
+              <w:t xml:space="preserve">140.00</w:t>
             </w:r>
           </w:p>
         </w:tc>
@@ -2968,7 +2968,7 @@
                 <w:sz w:val="30"/>
                 <w:szCs w:val="30"/>
               </w:rPr>
-              <w:t xml:space="preserve">2,782.00</w:t>
+              <w:t xml:space="preserve">2,140.00</w:t>
             </w:r>
           </w:p>
         </w:tc>
@@ -3069,7 +3069,7 @@
                 <w:sz w:val="30"/>
                 <w:szCs w:val="30"/>
               </w:rPr>
-              <w:t xml:space="preserve">2,600.00</w:t>
+              <w:t xml:space="preserve">2,000.00</w:t>
             </w:r>
           </w:p>
         </w:tc>
@@ -3101,7 +3101,7 @@
                 <w:sz w:val="30"/>
                 <w:szCs w:val="30"/>
               </w:rPr>
-              <w:t xml:space="preserve">182.00</w:t>
+              <w:t xml:space="preserve">140.00</w:t>
             </w:r>
           </w:p>
         </w:tc>
@@ -3133,7 +3133,7 @@
                 <w:sz w:val="30"/>
                 <w:szCs w:val="30"/>
               </w:rPr>
-              <w:t xml:space="preserve">2,782.00</w:t>
+              <w:t xml:space="preserve">2,140.00</w:t>
             </w:r>
           </w:p>
         </w:tc>
@@ -3234,7 +3234,7 @@
                 <w:sz w:val="30"/>
                 <w:szCs w:val="30"/>
               </w:rPr>
-              <w:t xml:space="preserve">2,600.00</w:t>
+              <w:t xml:space="preserve">2,000.00</w:t>
             </w:r>
           </w:p>
         </w:tc>
@@ -3266,7 +3266,7 @@
                 <w:sz w:val="30"/>
                 <w:szCs w:val="30"/>
               </w:rPr>
-              <w:t xml:space="preserve">182.00</w:t>
+              <w:t xml:space="preserve">140.00</w:t>
             </w:r>
           </w:p>
         </w:tc>
@@ -3298,7 +3298,7 @@
                 <w:sz w:val="30"/>
                 <w:szCs w:val="30"/>
               </w:rPr>
-              <w:t xml:space="preserve">2,782.00</w:t>
+              <w:t xml:space="preserve">2,140.00</w:t>
             </w:r>
           </w:p>
         </w:tc>
@@ -3399,7 +3399,7 @@
                 <w:sz w:val="30"/>
                 <w:szCs w:val="30"/>
               </w:rPr>
-              <w:t xml:space="preserve">2,600.00</w:t>
+              <w:t xml:space="preserve">2,000.00</w:t>
             </w:r>
           </w:p>
         </w:tc>
@@ -3431,7 +3431,7 @@
                 <w:sz w:val="30"/>
                 <w:szCs w:val="30"/>
               </w:rPr>
-              <w:t xml:space="preserve">182.00</w:t>
+              <w:t xml:space="preserve">140.00</w:t>
             </w:r>
           </w:p>
         </w:tc>
@@ -3463,7 +3463,7 @@
                 <w:sz w:val="30"/>
                 <w:szCs w:val="30"/>
               </w:rPr>
-              <w:t xml:space="preserve">2,782.00</w:t>
+              <w:t xml:space="preserve">2,140.00</w:t>
             </w:r>
           </w:p>
         </w:tc>
@@ -3564,7 +3564,7 @@
                 <w:sz w:val="30"/>
                 <w:szCs w:val="30"/>
               </w:rPr>
-              <w:t xml:space="preserve">2,600.00</w:t>
+              <w:t xml:space="preserve">2,000.00</w:t>
             </w:r>
           </w:p>
         </w:tc>
@@ -3596,7 +3596,7 @@
                 <w:sz w:val="30"/>
                 <w:szCs w:val="30"/>
               </w:rPr>
-              <w:t xml:space="preserve">182.00</w:t>
+              <w:t xml:space="preserve">140.00</w:t>
             </w:r>
           </w:p>
         </w:tc>
@@ -3628,7 +3628,7 @@
                 <w:sz w:val="30"/>
                 <w:szCs w:val="30"/>
               </w:rPr>
-              <w:t xml:space="preserve">2,782.00</w:t>
+              <w:t xml:space="preserve">2,140.00</w:t>
             </w:r>
           </w:p>
         </w:tc>
@@ -3729,7 +3729,7 @@
                 <w:sz w:val="30"/>
                 <w:szCs w:val="30"/>
               </w:rPr>
-              <w:t xml:space="preserve">2,600.00</w:t>
+              <w:t xml:space="preserve">2,000.00</w:t>
             </w:r>
           </w:p>
         </w:tc>
@@ -3761,7 +3761,7 @@
                 <w:sz w:val="30"/>
                 <w:szCs w:val="30"/>
               </w:rPr>
-              <w:t xml:space="preserve">182.00</w:t>
+              <w:t xml:space="preserve">140.00</w:t>
             </w:r>
           </w:p>
         </w:tc>
@@ -3793,7 +3793,7 @@
                 <w:sz w:val="30"/>
                 <w:szCs w:val="30"/>
               </w:rPr>
-              <w:t xml:space="preserve">2,782.00</w:t>
+              <w:t xml:space="preserve">2,140.00</w:t>
             </w:r>
           </w:p>
         </w:tc>
@@ -3894,7 +3894,7 @@
                 <w:sz w:val="30"/>
                 <w:szCs w:val="30"/>
               </w:rPr>
-              <w:t xml:space="preserve">2,600.00</w:t>
+              <w:t xml:space="preserve">2,000.00</w:t>
             </w:r>
           </w:p>
         </w:tc>
@@ -3926,7 +3926,7 @@
                 <w:sz w:val="30"/>
                 <w:szCs w:val="30"/>
               </w:rPr>
-              <w:t xml:space="preserve">182.00</w:t>
+              <w:t xml:space="preserve">140.00</w:t>
             </w:r>
           </w:p>
         </w:tc>
@@ -3958,7 +3958,7 @@
                 <w:sz w:val="30"/>
                 <w:szCs w:val="30"/>
               </w:rPr>
-              <w:t xml:space="preserve">2,782.00</w:t>
+              <w:t xml:space="preserve">2,140.00</w:t>
             </w:r>
           </w:p>
         </w:tc>
@@ -4059,7 +4059,7 @@
                 <w:sz w:val="30"/>
                 <w:szCs w:val="30"/>
               </w:rPr>
-              <w:t xml:space="preserve">2,600.00</w:t>
+              <w:t xml:space="preserve">2,000.00</w:t>
             </w:r>
           </w:p>
         </w:tc>
@@ -4091,7 +4091,7 @@
                 <w:sz w:val="30"/>
                 <w:szCs w:val="30"/>
               </w:rPr>
-              <w:t xml:space="preserve">182.00</w:t>
+              <w:t xml:space="preserve">140.00</w:t>
             </w:r>
           </w:p>
         </w:tc>
@@ -4123,7 +4123,7 @@
                 <w:sz w:val="30"/>
                 <w:szCs w:val="30"/>
               </w:rPr>
-              <w:t xml:space="preserve">2,782.00</w:t>
+              <w:t xml:space="preserve">2,140.00</w:t>
             </w:r>
           </w:p>
         </w:tc>
@@ -4224,7 +4224,7 @@
                 <w:sz w:val="30"/>
                 <w:szCs w:val="30"/>
               </w:rPr>
-              <w:t xml:space="preserve">2,600.00</w:t>
+              <w:t xml:space="preserve">2,000.00</w:t>
             </w:r>
           </w:p>
         </w:tc>
@@ -4256,7 +4256,7 @@
                 <w:sz w:val="30"/>
                 <w:szCs w:val="30"/>
               </w:rPr>
-              <w:t xml:space="preserve">182.00</w:t>
+              <w:t xml:space="preserve">140.00</w:t>
             </w:r>
           </w:p>
         </w:tc>
@@ -4288,7 +4288,7 @@
                 <w:sz w:val="30"/>
                 <w:szCs w:val="30"/>
               </w:rPr>
-              <w:t xml:space="preserve">2,782.00</w:t>
+              <w:t xml:space="preserve">2,140.00</w:t>
             </w:r>
           </w:p>
         </w:tc>
@@ -4389,7 +4389,7 @@
                 <w:sz w:val="30"/>
                 <w:szCs w:val="30"/>
               </w:rPr>
-              <w:t xml:space="preserve">2,600.00</w:t>
+              <w:t xml:space="preserve">2,000.00</w:t>
             </w:r>
           </w:p>
         </w:tc>
@@ -4421,7 +4421,7 @@
                 <w:sz w:val="30"/>
                 <w:szCs w:val="30"/>
               </w:rPr>
-              <w:t xml:space="preserve">182.00</w:t>
+              <w:t xml:space="preserve">140.00</w:t>
             </w:r>
           </w:p>
         </w:tc>
@@ -4453,7 +4453,7 @@
                 <w:sz w:val="30"/>
                 <w:szCs w:val="30"/>
               </w:rPr>
-              <w:t xml:space="preserve">2,782.00</w:t>
+              <w:t xml:space="preserve">2,140.00</w:t>
             </w:r>
           </w:p>
         </w:tc>
@@ -4554,7 +4554,7 @@
                 <w:sz w:val="30"/>
                 <w:szCs w:val="30"/>
               </w:rPr>
-              <w:t xml:space="preserve">2,600.00</w:t>
+              <w:t xml:space="preserve">2,000.00</w:t>
             </w:r>
           </w:p>
         </w:tc>
@@ -4586,7 +4586,7 @@
                 <w:sz w:val="30"/>
                 <w:szCs w:val="30"/>
               </w:rPr>
-              <w:t xml:space="preserve">182.00</w:t>
+              <w:t xml:space="preserve">140.00</w:t>
             </w:r>
           </w:p>
         </w:tc>
@@ -4618,7 +4618,7 @@
                 <w:sz w:val="30"/>
                 <w:szCs w:val="30"/>
               </w:rPr>
-              <w:t xml:space="preserve">2,782.00</w:t>
+              <w:t xml:space="preserve">2,140.00</w:t>
             </w:r>
           </w:p>
         </w:tc>
@@ -4719,7 +4719,7 @@
                 <w:sz w:val="30"/>
                 <w:szCs w:val="30"/>
               </w:rPr>
-              <w:t xml:space="preserve">2,600.00</w:t>
+              <w:t xml:space="preserve">2,000.00</w:t>
             </w:r>
           </w:p>
         </w:tc>
@@ -4751,7 +4751,7 @@
                 <w:sz w:val="30"/>
                 <w:szCs w:val="30"/>
               </w:rPr>
-              <w:t xml:space="preserve">182.00</w:t>
+              <w:t xml:space="preserve">140.00</w:t>
             </w:r>
           </w:p>
         </w:tc>
@@ -4783,7 +4783,7 @@
                 <w:sz w:val="30"/>
                 <w:szCs w:val="30"/>
               </w:rPr>
-              <w:t xml:space="preserve">2,782.00</w:t>
+              <w:t xml:space="preserve">2,140.00</w:t>
             </w:r>
           </w:p>
         </w:tc>
@@ -4884,7 +4884,7 @@
                 <w:sz w:val="30"/>
                 <w:szCs w:val="30"/>
               </w:rPr>
-              <w:t xml:space="preserve">2,600.00</w:t>
+              <w:t xml:space="preserve">2,000.00</w:t>
             </w:r>
           </w:p>
         </w:tc>
@@ -4916,7 +4916,7 @@
                 <w:sz w:val="30"/>
                 <w:szCs w:val="30"/>
               </w:rPr>
-              <w:t xml:space="preserve">182.00</w:t>
+              <w:t xml:space="preserve">140.00</w:t>
             </w:r>
           </w:p>
         </w:tc>
@@ -4948,7 +4948,7 @@
                 <w:sz w:val="30"/>
                 <w:szCs w:val="30"/>
               </w:rPr>
-              <w:t xml:space="preserve">2,782.00</w:t>
+              <w:t xml:space="preserve">2,140.00</w:t>
             </w:r>
           </w:p>
         </w:tc>
@@ -5049,7 +5049,7 @@
                 <w:sz w:val="30"/>
                 <w:szCs w:val="30"/>
               </w:rPr>
-              <w:t xml:space="preserve">2,600.00</w:t>
+              <w:t xml:space="preserve">2,000.00</w:t>
             </w:r>
           </w:p>
         </w:tc>
@@ -5081,7 +5081,7 @@
                 <w:sz w:val="30"/>
                 <w:szCs w:val="30"/>
               </w:rPr>
-              <w:t xml:space="preserve">182.00</w:t>
+              <w:t xml:space="preserve">140.00</w:t>
             </w:r>
           </w:p>
         </w:tc>
@@ -5113,7 +5113,7 @@
                 <w:sz w:val="30"/>
                 <w:szCs w:val="30"/>
               </w:rPr>
-              <w:t xml:space="preserve">2,782.00</w:t>
+              <w:t xml:space="preserve">2,140.00</w:t>
             </w:r>
           </w:p>
         </w:tc>
@@ -5214,7 +5214,7 @@
                 <w:sz w:val="30"/>
                 <w:szCs w:val="30"/>
               </w:rPr>
-              <w:t xml:space="preserve">2,600.00</w:t>
+              <w:t xml:space="preserve">2,000.00</w:t>
             </w:r>
           </w:p>
         </w:tc>
@@ -5246,7 +5246,7 @@
                 <w:sz w:val="30"/>
                 <w:szCs w:val="30"/>
               </w:rPr>
-              <w:t xml:space="preserve">182.00</w:t>
+              <w:t xml:space="preserve">140.00</w:t>
             </w:r>
           </w:p>
         </w:tc>
@@ -5278,7 +5278,7 @@
                 <w:sz w:val="30"/>
                 <w:szCs w:val="30"/>
               </w:rPr>
-              <w:t xml:space="preserve">2,782.00</w:t>
+              <w:t xml:space="preserve">2,140.00</w:t>
             </w:r>
           </w:p>
         </w:tc>
@@ -5379,7 +5379,7 @@
                 <w:sz w:val="30"/>
                 <w:szCs w:val="30"/>
               </w:rPr>
-              <w:t xml:space="preserve">62,800.00</w:t>
+              <w:t xml:space="preserve">52,000.00</w:t>
             </w:r>
           </w:p>
         </w:tc>
@@ -5411,7 +5411,7 @@
                 <w:sz w:val="30"/>
                 <w:szCs w:val="30"/>
               </w:rPr>
-              <w:t xml:space="preserve">4,396.00</w:t>
+              <w:t xml:space="preserve">3,640.00</w:t>
             </w:r>
           </w:p>
         </w:tc>
@@ -5443,7 +5443,7 @@
                 <w:sz w:val="30"/>
                 <w:szCs w:val="30"/>
               </w:rPr>
-              <w:t xml:space="preserve">67,196.00</w:t>
+              <w:t xml:space="preserve">55,640.00</w:t>
             </w:r>
           </w:p>
         </w:tc>
@@ -5463,7 +5463,7 @@
           <w:sz w:val="28"/>
           <w:szCs w:val="28"/>
         </w:rPr>
-        <w:t xml:space="preserve">หมายเหตุผู้ร่าง: ตารางนี้คิด VAT 7% เพิ่มจากราคา ฿62,800 ตามโฆษณาที่ระบุ "ก่อน VAT" หากราคาบนเว็บรวม VAT แล้ว ให้แก้ข้อ 2 และตารางนี้</w:t>
+        <w:t xml:space="preserve">หมายเหตุผู้ร่าง: ตารางนี้คิด VAT 7% เพิ่มจากราคา ฿52,000 ตามราคาที่ประกาศที่ระบุ "ก่อน VAT" หากราคาบนเว็บรวม VAT แล้ว ให้แก้ข้อ 2 และตารางนี้</w:t>
       </w:r>
     </w:p>
     <w:p>

</xml_diff>

<commit_message>
docs: hire-purchase contract includes the cabinet — 16,600 + 2,300×18 = 58,000
Co-Authored-By: Claude Opus 5.5 <noreply@anthropic.com>
Claude-Session: https://claude.ai/code/session_01JgxTQRAtuSbhFJ3Hyi5Qsm
</commit_message>
<xml_diff>
--- a/docs/contracts/สัญญาเช่าซื้อ-AED-Y8.docx
+++ b/docs/contracts/สัญญาเช่าซื้อ-AED-Y8.docx
@@ -640,6 +640,75 @@
                 <w:sz w:val="30"/>
                 <w:szCs w:val="30"/>
               </w:rPr>
+              <w:t xml:space="preserve">ตู้เก็บเครื่อง AED</w:t>
+            </w:r>
+          </w:p>
+        </w:tc>
+        <w:tc>
+          <w:tcPr>
+            <w:tcW w:type="dxa" w:w="6400"/>
+            <w:tcBorders>
+              <w:top w:val="single" w:color="808080" w:sz="4"/>
+              <w:left w:val="single" w:color="808080" w:sz="4"/>
+              <w:bottom w:val="single" w:color="808080" w:sz="4"/>
+              <w:right w:val="single" w:color="808080" w:sz="4"/>
+            </w:tcBorders>
+            <w:tcMar>
+              <w:top w:type="dxa" w:w="60"/>
+              <w:left w:type="dxa" w:w="100"/>
+              <w:bottom w:type="dxa" w:w="60"/>
+              <w:right w:type="dxa" w:w="100"/>
+            </w:tcMar>
+          </w:tcPr>
+          <w:p>
+            <w:pPr>
+              <w:jc w:val="left"/>
+            </w:pPr>
+            <w:r>
+              <w:rPr>
+                <w:rFonts w:ascii="TH SarabunPSK" w:cs="TH SarabunPSK" w:eastAsia="TH SarabunPSK" w:hAnsi="TH SarabunPSK"/>
+                <w:b w:val="false"/>
+                <w:bCs w:val="false"/>
+                <w:sz w:val="30"/>
+                <w:szCs w:val="30"/>
+              </w:rPr>
+              <w:t xml:space="preserve">ตู้ ☐ ติดผนัง ☐ ตั้งพื้น  ยี่ห้อ/รุ่น ________________</w:t>
+            </w:r>
+          </w:p>
+        </w:tc>
+      </w:tr>
+      <w:tr>
+        <w:trPr>
+          <w:tblHeader w:val="false"/>
+        </w:trPr>
+        <w:tc>
+          <w:tcPr>
+            <w:tcW w:type="dxa" w:w="2600"/>
+            <w:tcBorders>
+              <w:top w:val="single" w:color="808080" w:sz="4"/>
+              <w:left w:val="single" w:color="808080" w:sz="4"/>
+              <w:bottom w:val="single" w:color="808080" w:sz="4"/>
+              <w:right w:val="single" w:color="808080" w:sz="4"/>
+            </w:tcBorders>
+            <w:tcMar>
+              <w:top w:type="dxa" w:w="60"/>
+              <w:left w:type="dxa" w:w="100"/>
+              <w:bottom w:type="dxa" w:w="60"/>
+              <w:right w:type="dxa" w:w="100"/>
+            </w:tcMar>
+          </w:tcPr>
+          <w:p>
+            <w:pPr>
+              <w:jc w:val="left"/>
+            </w:pPr>
+            <w:r>
+              <w:rPr>
+                <w:rFonts w:ascii="TH SarabunPSK" w:cs="TH SarabunPSK" w:eastAsia="TH SarabunPSK" w:hAnsi="TH SarabunPSK"/>
+                <w:b w:val="false"/>
+                <w:bCs w:val="false"/>
+                <w:sz w:val="30"/>
+                <w:szCs w:val="30"/>
+              </w:rPr>
               <w:t xml:space="preserve">สถานที่ติดตั้ง</w:t>
             </w:r>
           </w:p>
@@ -724,8 +793,14 @@
           <w:sz w:val="32"/>
           <w:szCs w:val="32"/>
         </w:rPr>
-        <w:t xml:space="preserve"> ที่ผู้เช่าซื้อซื้อจากผู้ให้เช่าซื้อ เป็นการซื้อขายเด็ดขาดแยกต่างหากตามใบกำกับภาษีเลขที่ ________________ ตู้ดังกล่าว</w:t>
-      </w:r>
+        <w:t xml:space="preserve"> ตามตารางข้อ 1.1 เป็นส่วนหนึ่งของทรัพย์สินที่เช่าซื้อ และอยู่ภายใต้เงื่อนไขเรื่องกรรมสิทธิ์ การผิดนัด และการส่งคืนตามสัญญานี้เช่นเดียวกับตัวเครื่อง</w:t>
+      </w:r>
+    </w:p>
+    <w:p>
+      <w:pPr>
+        <w:keepNext/>
+        <w:spacing w:after="80" w:before="200"/>
+      </w:pPr>
       <w:r>
         <w:rPr>
           <w:rFonts w:ascii="TH SarabunPSK" w:cs="TH SarabunPSK" w:eastAsia="TH SarabunPSK" w:hAnsi="TH SarabunPSK"/>
@@ -734,30 +809,6 @@
           <w:sz w:val="32"/>
           <w:szCs w:val="32"/>
         </w:rPr>
-        <w:t xml:space="preserve">ไม่เป็นทรัพย์สินที่เช่าซื้อ</w:t>
-      </w:r>
-      <w:r>
-        <w:rPr>
-          <w:rFonts w:ascii="TH SarabunPSK" w:cs="TH SarabunPSK" w:eastAsia="TH SarabunPSK" w:hAnsi="TH SarabunPSK"/>
-          <w:sz w:val="32"/>
-          <w:szCs w:val="32"/>
-        </w:rPr>
-        <w:t xml:space="preserve">ตามสัญญานี้ และตกเป็นกรรมสิทธิ์ของผู้เช่าซื้อเมื่อชำระราคาตู้ครบถ้วน การผิดนัดหรือการเลิกสัญญาฉบับนี้ไม่กระทบกรรมสิทธิ์ในตู้</w:t>
-      </w:r>
-    </w:p>
-    <w:p>
-      <w:pPr>
-        <w:keepNext/>
-        <w:spacing w:after="80" w:before="200"/>
-      </w:pPr>
-      <w:r>
-        <w:rPr>
-          <w:rFonts w:ascii="TH SarabunPSK" w:cs="TH SarabunPSK" w:eastAsia="TH SarabunPSK" w:hAnsi="TH SarabunPSK"/>
-          <w:b/>
-          <w:bCs/>
-          <w:sz w:val="32"/>
-          <w:szCs w:val="32"/>
-        </w:rPr>
         <w:t xml:space="preserve">ข้อ 2  ราคาเช่าซื้อและการชำระเงิน</w:t>
       </w:r>
     </w:p>
@@ -783,7 +834,7 @@
           <w:sz w:val="32"/>
           <w:szCs w:val="32"/>
         </w:rPr>
-        <w:t xml:space="preserve">ราคาเช่าซื้อทั้งสิ้น 52,000.00 บาท (ห้าหมื่นสองพันบาทถ้วน) ยังไม่รวมภาษีมูลค่าเพิ่ม ผู้เช่าซื้อตกลงชำระดังนี้</w:t>
+        <w:t xml:space="preserve">ราคาเช่าซื้อทั้งสิ้น 58,000.00 บาท (ห้าหมื่นแปดพันบาทถ้วน) ยังไม่รวมภาษีมูลค่าเพิ่ม ประกอบด้วยค่าเครื่อง 52,000.00 บาท และค่าตู้เก็บเครื่อง 6,000.00 บาท ผู้เช่าซื้อตกลงชำระดังนี้</w:t>
       </w:r>
     </w:p>
     <w:p>
@@ -808,7 +859,7 @@
           <w:sz w:val="32"/>
           <w:szCs w:val="32"/>
         </w:rPr>
-        <w:t xml:space="preserve">(ก) เงินมัดจำ 16,000.00 บาท ชำระในวันทำสัญญา และให้ถือเป็นส่วนหนึ่งของราคาเช่าซื้อ</w:t>
+        <w:t xml:space="preserve">(ก) เงินมัดจำ 16,600.00 บาท ชำระในวันทำสัญญา และให้ถือเป็นส่วนหนึ่งของราคาเช่าซื้อ</w:t>
       </w:r>
     </w:p>
     <w:p>
@@ -833,7 +884,7 @@
           <w:sz w:val="32"/>
           <w:szCs w:val="32"/>
         </w:rPr>
-        <w:t xml:space="preserve">(ข) ค่าเช่าซื้อรายเดือน 18 งวด งวดละ 2,000.00 บาท ชำระภายในวันที่ ______ ของทุกเดือน เริ่มงวดแรกวันที่ ______________ และงวดสุดท้ายวันที่ ______________ ตามตารางการชำระเงินในเอกสารแนบ 1</w:t>
+        <w:t xml:space="preserve">(ข) ค่าเช่าซื้อรายเดือน 18 งวด งวดละ 2,300.00 บาท ชำระภายในวันที่ ______ ของทุกเดือน เริ่มงวดแรกวันที่ ______________ และงวดสุดท้ายวันที่ ______________ ตามตารางการชำระเงินในเอกสารแนบ 1</w:t>
       </w:r>
     </w:p>
     <w:p>
@@ -1497,7 +1548,7 @@
           <w:sz w:val="32"/>
           <w:szCs w:val="32"/>
         </w:rPr>
-        <w:t xml:space="preserve">เมื่อสัญญาเลิกกันตามข้อ 7.2 ผู้เช่าซื้อต้องส่งคืนทรัพย์สินที่เช่าซื้อในสภาพที่ใช้งานได้ตามปกติภายใน 7 วัน หรือยินยอมให้ผู้ให้เช่าซื้อเข้ารับคืน ณ สถานที่ติดตั้ง เงินที่ผู้เช่าซื้อชำระมาแล้วทั้งหมดตกเป็นของผู้ให้เช่าซื้อ และผู้ให้เช่าซื้อมีสิทธิเรียกค่าเช่าซื้อที่ค้างชำระจนถึงวันเลิกสัญญา</w:t>
+        <w:t xml:space="preserve">เมื่อสัญญาเลิกกันตามข้อ 7.2 ผู้เช่าซื้อต้องส่งคืนทรัพย์สินที่เช่าซื้อในสภาพที่ใช้งานได้ตามปกติภายใน 7 วัน หรือยินยอมให้ผู้ให้เช่าซื้อเข้ารับคืน ณ สถานที่ติดตั้ง เงินที่ผู้เช่าซื้อชำระมาแล้วทั้งหมดตกเป็นของผู้ให้เช่าซื้อ และผู้ให้เช่าซื้อมีสิทธิเรียกค่าเช่าซื้อที่ค้างชำระจนถึงวันเลิกสัญญา ทั้งนี้ผู้เช่าซื้อยินยอมให้ผู้ให้เช่าซื้อถอดตู้ที่ยึดติดกับอาคารออก โดยผู้ให้เช่าซื้อไม่ต้องรับผิดซ่อมแซมผนังหรือพื้นที่ติดตั้ง</w:t>
       </w:r>
     </w:p>
     <w:p>
@@ -2037,7 +2088,7 @@
           <w:sz w:val="32"/>
           <w:szCs w:val="32"/>
         </w:rPr>
-        <w:t xml:space="preserve">แนบท้ายสัญญาเช่าซื้อเลขที่ ________________  ทรัพย์สิน: Yuwell (PRIMEDIC HeartSave) Y8  S/N ________________</w:t>
+        <w:t xml:space="preserve">แนบท้ายสัญญาเช่าซื้อเลขที่ ________________  ทรัพย์สิน: Yuwell (PRIMEDIC HeartSave) Y8 พร้อมตู้  S/N ________________</w:t>
       </w:r>
     </w:p>
     <w:tbl>
@@ -2325,7 +2376,7 @@
                 <w:sz w:val="30"/>
                 <w:szCs w:val="30"/>
               </w:rPr>
-              <w:t xml:space="preserve">16,000.00</w:t>
+              <w:t xml:space="preserve">16,600.00</w:t>
             </w:r>
           </w:p>
         </w:tc>
@@ -2357,7 +2408,7 @@
                 <w:sz w:val="30"/>
                 <w:szCs w:val="30"/>
               </w:rPr>
-              <w:t xml:space="preserve">1,120.00</w:t>
+              <w:t xml:space="preserve">1,162.00</w:t>
             </w:r>
           </w:p>
         </w:tc>
@@ -2389,7 +2440,7 @@
                 <w:sz w:val="30"/>
                 <w:szCs w:val="30"/>
               </w:rPr>
-              <w:t xml:space="preserve">17,120.00</w:t>
+              <w:t xml:space="preserve">17,762.00</w:t>
             </w:r>
           </w:p>
         </w:tc>
@@ -2490,7 +2541,7 @@
                 <w:sz w:val="30"/>
                 <w:szCs w:val="30"/>
               </w:rPr>
-              <w:t xml:space="preserve">2,000.00</w:t>
+              <w:t xml:space="preserve">2,300.00</w:t>
             </w:r>
           </w:p>
         </w:tc>
@@ -2522,7 +2573,7 @@
                 <w:sz w:val="30"/>
                 <w:szCs w:val="30"/>
               </w:rPr>
-              <w:t xml:space="preserve">140.00</w:t>
+              <w:t xml:space="preserve">161.00</w:t>
             </w:r>
           </w:p>
         </w:tc>
@@ -2554,7 +2605,7 @@
                 <w:sz w:val="30"/>
                 <w:szCs w:val="30"/>
               </w:rPr>
-              <w:t xml:space="preserve">2,140.00</w:t>
+              <w:t xml:space="preserve">2,461.00</w:t>
             </w:r>
           </w:p>
         </w:tc>
@@ -2655,7 +2706,7 @@
                 <w:sz w:val="30"/>
                 <w:szCs w:val="30"/>
               </w:rPr>
-              <w:t xml:space="preserve">2,000.00</w:t>
+              <w:t xml:space="preserve">2,300.00</w:t>
             </w:r>
           </w:p>
         </w:tc>
@@ -2687,7 +2738,7 @@
                 <w:sz w:val="30"/>
                 <w:szCs w:val="30"/>
               </w:rPr>
-              <w:t xml:space="preserve">140.00</w:t>
+              <w:t xml:space="preserve">161.00</w:t>
             </w:r>
           </w:p>
         </w:tc>
@@ -2719,7 +2770,7 @@
                 <w:sz w:val="30"/>
                 <w:szCs w:val="30"/>
               </w:rPr>
-              <w:t xml:space="preserve">2,140.00</w:t>
+              <w:t xml:space="preserve">2,461.00</w:t>
             </w:r>
           </w:p>
         </w:tc>
@@ -2820,7 +2871,7 @@
                 <w:sz w:val="30"/>
                 <w:szCs w:val="30"/>
               </w:rPr>
-              <w:t xml:space="preserve">2,000.00</w:t>
+              <w:t xml:space="preserve">2,300.00</w:t>
             </w:r>
           </w:p>
         </w:tc>
@@ -2852,7 +2903,7 @@
                 <w:sz w:val="30"/>
                 <w:szCs w:val="30"/>
               </w:rPr>
-              <w:t xml:space="preserve">140.00</w:t>
+              <w:t xml:space="preserve">161.00</w:t>
             </w:r>
           </w:p>
         </w:tc>
@@ -2884,7 +2935,7 @@
                 <w:sz w:val="30"/>
                 <w:szCs w:val="30"/>
               </w:rPr>
-              <w:t xml:space="preserve">2,140.00</w:t>
+              <w:t xml:space="preserve">2,461.00</w:t>
             </w:r>
           </w:p>
         </w:tc>
@@ -2985,7 +3036,7 @@
                 <w:sz w:val="30"/>
                 <w:szCs w:val="30"/>
               </w:rPr>
-              <w:t xml:space="preserve">2,000.00</w:t>
+              <w:t xml:space="preserve">2,300.00</w:t>
             </w:r>
           </w:p>
         </w:tc>
@@ -3017,7 +3068,7 @@
                 <w:sz w:val="30"/>
                 <w:szCs w:val="30"/>
               </w:rPr>
-              <w:t xml:space="preserve">140.00</w:t>
+              <w:t xml:space="preserve">161.00</w:t>
             </w:r>
           </w:p>
         </w:tc>
@@ -3049,7 +3100,7 @@
                 <w:sz w:val="30"/>
                 <w:szCs w:val="30"/>
               </w:rPr>
-              <w:t xml:space="preserve">2,140.00</w:t>
+              <w:t xml:space="preserve">2,461.00</w:t>
             </w:r>
           </w:p>
         </w:tc>
@@ -3150,7 +3201,7 @@
                 <w:sz w:val="30"/>
                 <w:szCs w:val="30"/>
               </w:rPr>
-              <w:t xml:space="preserve">2,000.00</w:t>
+              <w:t xml:space="preserve">2,300.00</w:t>
             </w:r>
           </w:p>
         </w:tc>
@@ -3182,7 +3233,7 @@
                 <w:sz w:val="30"/>
                 <w:szCs w:val="30"/>
               </w:rPr>
-              <w:t xml:space="preserve">140.00</w:t>
+              <w:t xml:space="preserve">161.00</w:t>
             </w:r>
           </w:p>
         </w:tc>
@@ -3214,7 +3265,7 @@
                 <w:sz w:val="30"/>
                 <w:szCs w:val="30"/>
               </w:rPr>
-              <w:t xml:space="preserve">2,140.00</w:t>
+              <w:t xml:space="preserve">2,461.00</w:t>
             </w:r>
           </w:p>
         </w:tc>
@@ -3315,7 +3366,7 @@
                 <w:sz w:val="30"/>
                 <w:szCs w:val="30"/>
               </w:rPr>
-              <w:t xml:space="preserve">2,000.00</w:t>
+              <w:t xml:space="preserve">2,300.00</w:t>
             </w:r>
           </w:p>
         </w:tc>
@@ -3347,7 +3398,7 @@
                 <w:sz w:val="30"/>
                 <w:szCs w:val="30"/>
               </w:rPr>
-              <w:t xml:space="preserve">140.00</w:t>
+              <w:t xml:space="preserve">161.00</w:t>
             </w:r>
           </w:p>
         </w:tc>
@@ -3379,7 +3430,7 @@
                 <w:sz w:val="30"/>
                 <w:szCs w:val="30"/>
               </w:rPr>
-              <w:t xml:space="preserve">2,140.00</w:t>
+              <w:t xml:space="preserve">2,461.00</w:t>
             </w:r>
           </w:p>
         </w:tc>
@@ -3480,7 +3531,7 @@
                 <w:sz w:val="30"/>
                 <w:szCs w:val="30"/>
               </w:rPr>
-              <w:t xml:space="preserve">2,000.00</w:t>
+              <w:t xml:space="preserve">2,300.00</w:t>
             </w:r>
           </w:p>
         </w:tc>
@@ -3512,7 +3563,7 @@
                 <w:sz w:val="30"/>
                 <w:szCs w:val="30"/>
               </w:rPr>
-              <w:t xml:space="preserve">140.00</w:t>
+              <w:t xml:space="preserve">161.00</w:t>
             </w:r>
           </w:p>
         </w:tc>
@@ -3544,7 +3595,7 @@
                 <w:sz w:val="30"/>
                 <w:szCs w:val="30"/>
               </w:rPr>
-              <w:t xml:space="preserve">2,140.00</w:t>
+              <w:t xml:space="preserve">2,461.00</w:t>
             </w:r>
           </w:p>
         </w:tc>
@@ -3645,7 +3696,7 @@
                 <w:sz w:val="30"/>
                 <w:szCs w:val="30"/>
               </w:rPr>
-              <w:t xml:space="preserve">2,000.00</w:t>
+              <w:t xml:space="preserve">2,300.00</w:t>
             </w:r>
           </w:p>
         </w:tc>
@@ -3677,7 +3728,7 @@
                 <w:sz w:val="30"/>
                 <w:szCs w:val="30"/>
               </w:rPr>
-              <w:t xml:space="preserve">140.00</w:t>
+              <w:t xml:space="preserve">161.00</w:t>
             </w:r>
           </w:p>
         </w:tc>
@@ -3709,7 +3760,7 @@
                 <w:sz w:val="30"/>
                 <w:szCs w:val="30"/>
               </w:rPr>
-              <w:t xml:space="preserve">2,140.00</w:t>
+              <w:t xml:space="preserve">2,461.00</w:t>
             </w:r>
           </w:p>
         </w:tc>
@@ -3810,7 +3861,7 @@
                 <w:sz w:val="30"/>
                 <w:szCs w:val="30"/>
               </w:rPr>
-              <w:t xml:space="preserve">2,000.00</w:t>
+              <w:t xml:space="preserve">2,300.00</w:t>
             </w:r>
           </w:p>
         </w:tc>
@@ -3842,7 +3893,7 @@
                 <w:sz w:val="30"/>
                 <w:szCs w:val="30"/>
               </w:rPr>
-              <w:t xml:space="preserve">140.00</w:t>
+              <w:t xml:space="preserve">161.00</w:t>
             </w:r>
           </w:p>
         </w:tc>
@@ -3874,7 +3925,7 @@
                 <w:sz w:val="30"/>
                 <w:szCs w:val="30"/>
               </w:rPr>
-              <w:t xml:space="preserve">2,140.00</w:t>
+              <w:t xml:space="preserve">2,461.00</w:t>
             </w:r>
           </w:p>
         </w:tc>
@@ -3975,7 +4026,7 @@
                 <w:sz w:val="30"/>
                 <w:szCs w:val="30"/>
               </w:rPr>
-              <w:t xml:space="preserve">2,000.00</w:t>
+              <w:t xml:space="preserve">2,300.00</w:t>
             </w:r>
           </w:p>
         </w:tc>
@@ -4007,7 +4058,7 @@
                 <w:sz w:val="30"/>
                 <w:szCs w:val="30"/>
               </w:rPr>
-              <w:t xml:space="preserve">140.00</w:t>
+              <w:t xml:space="preserve">161.00</w:t>
             </w:r>
           </w:p>
         </w:tc>
@@ -4039,7 +4090,7 @@
                 <w:sz w:val="30"/>
                 <w:szCs w:val="30"/>
               </w:rPr>
-              <w:t xml:space="preserve">2,140.00</w:t>
+              <w:t xml:space="preserve">2,461.00</w:t>
             </w:r>
           </w:p>
         </w:tc>
@@ -4140,7 +4191,7 @@
                 <w:sz w:val="30"/>
                 <w:szCs w:val="30"/>
               </w:rPr>
-              <w:t xml:space="preserve">2,000.00</w:t>
+              <w:t xml:space="preserve">2,300.00</w:t>
             </w:r>
           </w:p>
         </w:tc>
@@ -4172,7 +4223,7 @@
                 <w:sz w:val="30"/>
                 <w:szCs w:val="30"/>
               </w:rPr>
-              <w:t xml:space="preserve">140.00</w:t>
+              <w:t xml:space="preserve">161.00</w:t>
             </w:r>
           </w:p>
         </w:tc>
@@ -4204,7 +4255,7 @@
                 <w:sz w:val="30"/>
                 <w:szCs w:val="30"/>
               </w:rPr>
-              <w:t xml:space="preserve">2,140.00</w:t>
+              <w:t xml:space="preserve">2,461.00</w:t>
             </w:r>
           </w:p>
         </w:tc>
@@ -4305,7 +4356,7 @@
                 <w:sz w:val="30"/>
                 <w:szCs w:val="30"/>
               </w:rPr>
-              <w:t xml:space="preserve">2,000.00</w:t>
+              <w:t xml:space="preserve">2,300.00</w:t>
             </w:r>
           </w:p>
         </w:tc>
@@ -4337,7 +4388,7 @@
                 <w:sz w:val="30"/>
                 <w:szCs w:val="30"/>
               </w:rPr>
-              <w:t xml:space="preserve">140.00</w:t>
+              <w:t xml:space="preserve">161.00</w:t>
             </w:r>
           </w:p>
         </w:tc>
@@ -4369,7 +4420,7 @@
                 <w:sz w:val="30"/>
                 <w:szCs w:val="30"/>
               </w:rPr>
-              <w:t xml:space="preserve">2,140.00</w:t>
+              <w:t xml:space="preserve">2,461.00</w:t>
             </w:r>
           </w:p>
         </w:tc>
@@ -4470,7 +4521,7 @@
                 <w:sz w:val="30"/>
                 <w:szCs w:val="30"/>
               </w:rPr>
-              <w:t xml:space="preserve">2,000.00</w:t>
+              <w:t xml:space="preserve">2,300.00</w:t>
             </w:r>
           </w:p>
         </w:tc>
@@ -4502,7 +4553,7 @@
                 <w:sz w:val="30"/>
                 <w:szCs w:val="30"/>
               </w:rPr>
-              <w:t xml:space="preserve">140.00</w:t>
+              <w:t xml:space="preserve">161.00</w:t>
             </w:r>
           </w:p>
         </w:tc>
@@ -4534,7 +4585,7 @@
                 <w:sz w:val="30"/>
                 <w:szCs w:val="30"/>
               </w:rPr>
-              <w:t xml:space="preserve">2,140.00</w:t>
+              <w:t xml:space="preserve">2,461.00</w:t>
             </w:r>
           </w:p>
         </w:tc>
@@ -4635,7 +4686,7 @@
                 <w:sz w:val="30"/>
                 <w:szCs w:val="30"/>
               </w:rPr>
-              <w:t xml:space="preserve">2,000.00</w:t>
+              <w:t xml:space="preserve">2,300.00</w:t>
             </w:r>
           </w:p>
         </w:tc>
@@ -4667,7 +4718,7 @@
                 <w:sz w:val="30"/>
                 <w:szCs w:val="30"/>
               </w:rPr>
-              <w:t xml:space="preserve">140.00</w:t>
+              <w:t xml:space="preserve">161.00</w:t>
             </w:r>
           </w:p>
         </w:tc>
@@ -4699,7 +4750,7 @@
                 <w:sz w:val="30"/>
                 <w:szCs w:val="30"/>
               </w:rPr>
-              <w:t xml:space="preserve">2,140.00</w:t>
+              <w:t xml:space="preserve">2,461.00</w:t>
             </w:r>
           </w:p>
         </w:tc>
@@ -4800,7 +4851,7 @@
                 <w:sz w:val="30"/>
                 <w:szCs w:val="30"/>
               </w:rPr>
-              <w:t xml:space="preserve">2,000.00</w:t>
+              <w:t xml:space="preserve">2,300.00</w:t>
             </w:r>
           </w:p>
         </w:tc>
@@ -4832,7 +4883,7 @@
                 <w:sz w:val="30"/>
                 <w:szCs w:val="30"/>
               </w:rPr>
-              <w:t xml:space="preserve">140.00</w:t>
+              <w:t xml:space="preserve">161.00</w:t>
             </w:r>
           </w:p>
         </w:tc>
@@ -4864,7 +4915,7 @@
                 <w:sz w:val="30"/>
                 <w:szCs w:val="30"/>
               </w:rPr>
-              <w:t xml:space="preserve">2,140.00</w:t>
+              <w:t xml:space="preserve">2,461.00</w:t>
             </w:r>
           </w:p>
         </w:tc>
@@ -4965,7 +5016,7 @@
                 <w:sz w:val="30"/>
                 <w:szCs w:val="30"/>
               </w:rPr>
-              <w:t xml:space="preserve">2,000.00</w:t>
+              <w:t xml:space="preserve">2,300.00</w:t>
             </w:r>
           </w:p>
         </w:tc>
@@ -4997,7 +5048,7 @@
                 <w:sz w:val="30"/>
                 <w:szCs w:val="30"/>
               </w:rPr>
-              <w:t xml:space="preserve">140.00</w:t>
+              <w:t xml:space="preserve">161.00</w:t>
             </w:r>
           </w:p>
         </w:tc>
@@ -5029,7 +5080,7 @@
                 <w:sz w:val="30"/>
                 <w:szCs w:val="30"/>
               </w:rPr>
-              <w:t xml:space="preserve">2,140.00</w:t>
+              <w:t xml:space="preserve">2,461.00</w:t>
             </w:r>
           </w:p>
         </w:tc>
@@ -5130,7 +5181,7 @@
                 <w:sz w:val="30"/>
                 <w:szCs w:val="30"/>
               </w:rPr>
-              <w:t xml:space="preserve">2,000.00</w:t>
+              <w:t xml:space="preserve">2,300.00</w:t>
             </w:r>
           </w:p>
         </w:tc>
@@ -5162,7 +5213,7 @@
                 <w:sz w:val="30"/>
                 <w:szCs w:val="30"/>
               </w:rPr>
-              <w:t xml:space="preserve">140.00</w:t>
+              <w:t xml:space="preserve">161.00</w:t>
             </w:r>
           </w:p>
         </w:tc>
@@ -5194,7 +5245,7 @@
                 <w:sz w:val="30"/>
                 <w:szCs w:val="30"/>
               </w:rPr>
-              <w:t xml:space="preserve">2,140.00</w:t>
+              <w:t xml:space="preserve">2,461.00</w:t>
             </w:r>
           </w:p>
         </w:tc>
@@ -5295,7 +5346,7 @@
                 <w:sz w:val="30"/>
                 <w:szCs w:val="30"/>
               </w:rPr>
-              <w:t xml:space="preserve">2,000.00</w:t>
+              <w:t xml:space="preserve">2,300.00</w:t>
             </w:r>
           </w:p>
         </w:tc>
@@ -5327,7 +5378,7 @@
                 <w:sz w:val="30"/>
                 <w:szCs w:val="30"/>
               </w:rPr>
-              <w:t xml:space="preserve">140.00</w:t>
+              <w:t xml:space="preserve">161.00</w:t>
             </w:r>
           </w:p>
         </w:tc>
@@ -5359,7 +5410,7 @@
                 <w:sz w:val="30"/>
                 <w:szCs w:val="30"/>
               </w:rPr>
-              <w:t xml:space="preserve">2,140.00</w:t>
+              <w:t xml:space="preserve">2,461.00</w:t>
             </w:r>
           </w:p>
         </w:tc>
@@ -5460,7 +5511,7 @@
                 <w:sz w:val="30"/>
                 <w:szCs w:val="30"/>
               </w:rPr>
-              <w:t xml:space="preserve">52,000.00</w:t>
+              <w:t xml:space="preserve">58,000.00</w:t>
             </w:r>
           </w:p>
         </w:tc>
@@ -5492,7 +5543,7 @@
                 <w:sz w:val="30"/>
                 <w:szCs w:val="30"/>
               </w:rPr>
-              <w:t xml:space="preserve">3,640.00</w:t>
+              <w:t xml:space="preserve">4,060.00</w:t>
             </w:r>
           </w:p>
         </w:tc>
@@ -5524,7 +5575,7 @@
                 <w:sz w:val="30"/>
                 <w:szCs w:val="30"/>
               </w:rPr>
-              <w:t xml:space="preserve">55,640.00</w:t>
+              <w:t xml:space="preserve">62,060.00</w:t>
             </w:r>
           </w:p>
         </w:tc>
@@ -5544,7 +5595,7 @@
           <w:sz w:val="28"/>
           <w:szCs w:val="28"/>
         </w:rPr>
-        <w:t xml:space="preserve">หมายเหตุผู้ร่าง: ตารางนี้คิด VAT 7% เพิ่มจากราคา ฿52,000 (ถือว่าราคาที่ประกาศยังไม่รวม VAT) หากราคาที่ตกลงกับลูกค้ารวม VAT แล้ว ให้แก้ข้อ 2 และตารางนี้</w:t>
+        <w:t xml:space="preserve">หมายเหตุผู้ร่าง: ตารางนี้คิด VAT 7% เพิ่มจากราคา ฿58,000 (ถือว่าราคาที่ประกาศยังไม่รวม VAT) หากราคาที่ตกลงกับลูกค้ารวม VAT แล้ว ให้แก้ข้อ 2 และตารางนี้</w:t>
       </w:r>
     </w:p>
     <w:p>
@@ -6214,7 +6265,7 @@
                 <w:sz w:val="30"/>
                 <w:szCs w:val="30"/>
               </w:rPr>
-              <w:t xml:space="preserve">กระเป๋าใส่เครื่อง</w:t>
+              <w:t xml:space="preserve">ตู้เก็บเครื่อง AED</w:t>
             </w:r>
           </w:p>
         </w:tc>
@@ -6347,6 +6398,139 @@
                 <w:sz w:val="30"/>
                 <w:szCs w:val="30"/>
               </w:rPr>
+              <w:t xml:space="preserve">กระเป๋าใส่เครื่อง</w:t>
+            </w:r>
+          </w:p>
+        </w:tc>
+        <w:tc>
+          <w:tcPr>
+            <w:tcW w:type="dxa" w:w="2200"/>
+            <w:tcBorders>
+              <w:top w:val="single" w:color="808080" w:sz="4"/>
+              <w:left w:val="single" w:color="808080" w:sz="4"/>
+              <w:bottom w:val="single" w:color="808080" w:sz="4"/>
+              <w:right w:val="single" w:color="808080" w:sz="4"/>
+            </w:tcBorders>
+            <w:tcMar>
+              <w:top w:type="dxa" w:w="60"/>
+              <w:left w:type="dxa" w:w="100"/>
+              <w:bottom w:type="dxa" w:w="60"/>
+              <w:right w:type="dxa" w:w="100"/>
+            </w:tcMar>
+          </w:tcPr>
+          <w:p>
+            <w:pPr>
+              <w:jc w:val="left"/>
+            </w:pPr>
+            <w:r>
+              <w:rPr>
+                <w:rFonts w:ascii="TH SarabunPSK" w:cs="TH SarabunPSK" w:eastAsia="TH SarabunPSK" w:hAnsi="TH SarabunPSK"/>
+                <w:b w:val="false"/>
+                <w:bCs w:val="false"/>
+                <w:sz w:val="30"/>
+                <w:szCs w:val="30"/>
+              </w:rPr>
+              <w:t xml:space="preserve"/>
+            </w:r>
+          </w:p>
+        </w:tc>
+        <w:tc>
+          <w:tcPr>
+            <w:tcW w:type="dxa" w:w="1800"/>
+            <w:tcBorders>
+              <w:top w:val="single" w:color="808080" w:sz="4"/>
+              <w:left w:val="single" w:color="808080" w:sz="4"/>
+              <w:bottom w:val="single" w:color="808080" w:sz="4"/>
+              <w:right w:val="single" w:color="808080" w:sz="4"/>
+            </w:tcBorders>
+            <w:tcMar>
+              <w:top w:type="dxa" w:w="60"/>
+              <w:left w:type="dxa" w:w="100"/>
+              <w:bottom w:type="dxa" w:w="60"/>
+              <w:right w:type="dxa" w:w="100"/>
+            </w:tcMar>
+          </w:tcPr>
+          <w:p>
+            <w:pPr>
+              <w:jc w:val="left"/>
+            </w:pPr>
+            <w:r>
+              <w:rPr>
+                <w:rFonts w:ascii="TH SarabunPSK" w:cs="TH SarabunPSK" w:eastAsia="TH SarabunPSK" w:hAnsi="TH SarabunPSK"/>
+                <w:b w:val="false"/>
+                <w:bCs w:val="false"/>
+                <w:sz w:val="30"/>
+                <w:szCs w:val="30"/>
+              </w:rPr>
+              <w:t xml:space="preserve">☐ ปกติ</w:t>
+            </w:r>
+          </w:p>
+        </w:tc>
+      </w:tr>
+      <w:tr>
+        <w:trPr>
+          <w:tblHeader w:val="false"/>
+        </w:trPr>
+        <w:tc>
+          <w:tcPr>
+            <w:tcW w:type="dxa" w:w="600"/>
+            <w:tcBorders>
+              <w:top w:val="single" w:color="808080" w:sz="4"/>
+              <w:left w:val="single" w:color="808080" w:sz="4"/>
+              <w:bottom w:val="single" w:color="808080" w:sz="4"/>
+              <w:right w:val="single" w:color="808080" w:sz="4"/>
+            </w:tcBorders>
+            <w:tcMar>
+              <w:top w:type="dxa" w:w="60"/>
+              <w:left w:type="dxa" w:w="100"/>
+              <w:bottom w:type="dxa" w:w="60"/>
+              <w:right w:type="dxa" w:w="100"/>
+            </w:tcMar>
+          </w:tcPr>
+          <w:p>
+            <w:pPr>
+              <w:jc w:val="left"/>
+            </w:pPr>
+            <w:r>
+              <w:rPr>
+                <w:rFonts w:ascii="TH SarabunPSK" w:cs="TH SarabunPSK" w:eastAsia="TH SarabunPSK" w:hAnsi="TH SarabunPSK"/>
+                <w:b w:val="false"/>
+                <w:bCs w:val="false"/>
+                <w:sz w:val="30"/>
+                <w:szCs w:val="30"/>
+              </w:rPr>
+              <w:t xml:space="preserve">6</w:t>
+            </w:r>
+          </w:p>
+        </w:tc>
+        <w:tc>
+          <w:tcPr>
+            <w:tcW w:type="dxa" w:w="4400"/>
+            <w:tcBorders>
+              <w:top w:val="single" w:color="808080" w:sz="4"/>
+              <w:left w:val="single" w:color="808080" w:sz="4"/>
+              <w:bottom w:val="single" w:color="808080" w:sz="4"/>
+              <w:right w:val="single" w:color="808080" w:sz="4"/>
+            </w:tcBorders>
+            <w:tcMar>
+              <w:top w:type="dxa" w:w="60"/>
+              <w:left w:type="dxa" w:w="100"/>
+              <w:bottom w:type="dxa" w:w="60"/>
+              <w:right w:type="dxa" w:w="100"/>
+            </w:tcMar>
+          </w:tcPr>
+          <w:p>
+            <w:pPr>
+              <w:jc w:val="left"/>
+            </w:pPr>
+            <w:r>
+              <w:rPr>
+                <w:rFonts w:ascii="TH SarabunPSK" w:cs="TH SarabunPSK" w:eastAsia="TH SarabunPSK" w:hAnsi="TH SarabunPSK"/>
+                <w:b w:val="false"/>
+                <w:bCs w:val="false"/>
+                <w:sz w:val="30"/>
+                <w:szCs w:val="30"/>
+              </w:rPr>
               <w:t xml:space="preserve">คู่มือการใช้งาน</w:t>
             </w:r>
           </w:p>
@@ -6682,7 +6866,7 @@
           <w:sz w:val="32"/>
           <w:szCs w:val="32"/>
         </w:rPr>
-        <w:t xml:space="preserve">ผู้ค้ำประกันรับผิดในวงเงินไม่เกิน 55,640.00 บาท (ราคาเช่าซื้อรวมภาษีมูลค่าเพิ่ม) พร้อมดอกเบี้ยผิดนัดและค่าใช้จ่ายในการติดตามทวงถามตามจริง</w:t>
+        <w:t xml:space="preserve">ผู้ค้ำประกันรับผิดในวงเงินไม่เกิน 62,060.00 บาท (ราคาเช่าซื้อรวมภาษีมูลค่าเพิ่ม) พร้อมดอกเบี้ยผิดนัดและค่าใช้จ่ายในการติดตามทวงถามตามจริง</w:t>
       </w:r>
     </w:p>
     <w:p>

</xml_diff>

<commit_message>
docs: contract review fixes — down payment wording, non-return damages, liability limit, insolvency default, VAT timing, cabinet label/warranty, filled terms
Co-Authored-By: Claude Opus 5.5 <noreply@anthropic.com>
Claude-Session: https://claude.ai/code/session_01JgxTQRAtuSbhFJ3Hyi5Qsm
</commit_message>
<xml_diff>
--- a/docs/contracts/สัญญาเช่าซื้อ-AED-Y8.docx
+++ b/docs/contracts/สัญญาเช่าซื้อ-AED-Y8.docx
@@ -859,7 +859,7 @@
           <w:sz w:val="32"/>
           <w:szCs w:val="32"/>
         </w:rPr>
-        <w:t xml:space="preserve">(ก) เงินมัดจำ 16,600.00 บาท ชำระในวันทำสัญญา และให้ถือเป็นส่วนหนึ่งของราคาเช่าซื้อ</w:t>
+        <w:t xml:space="preserve">(ก) เงินดาวน์ (ค่าเช่าซื้องวดแรก) 16,600.00 บาท ชำระในวันทำสัญญา เป็นส่วนหนึ่งของราคาเช่าซื้อ มิใช่มัดจำหรือเงินประกัน</w:t>
       </w:r>
     </w:p>
     <w:p>
@@ -909,7 +909,7 @@
           <w:sz w:val="32"/>
           <w:szCs w:val="32"/>
         </w:rPr>
-        <w:t xml:space="preserve">ผู้เช่าซื้อต้องชำระภาษีมูลค่าเพิ่มในอัตราตามกฎหมายเพิ่มจากค่าเช่าซื้อแต่ละงวด ผู้ให้เช่าซื้อจะออกใบกำกับภาษีและใบเสร็จรับเงินให้ทุกงวดที่ได้รับชำระ</w:t>
+        <w:t xml:space="preserve">ผู้เช่าซื้อต้องชำระภาษีมูลค่าเพิ่มในอัตราตามกฎหมายเพิ่มจากค่าเช่าซื้อแต่ละงวด ผู้ให้เช่าซื้อจะออกใบกำกับภาษีเมื่อถึงกำหนดชำระแต่ละงวด และออกใบเสร็จรับเงินเมื่อได้รับชำระ</w:t>
       </w:r>
     </w:p>
     <w:p>
@@ -1050,7 +1050,7 @@
           <w:sz w:val="32"/>
           <w:szCs w:val="32"/>
         </w:rPr>
-        <w:t xml:space="preserve">ผู้ให้เช่าซื้อจะติดป้ายแสดงกรรมสิทธิ์ "ทรัพย์สินของบริษัท เจี่ยรักษา จำกัด จนกว่าชำระครบ" พร้อมหมายเลขเครื่องไว้ที่ตัวเครื่อง และจะนำป้ายออกให้เมื่อกรรมสิทธิ์โอนตามข้อ 3.2</w:t>
+        <w:t xml:space="preserve">ผู้ให้เช่าซื้อจะติดป้ายแสดงกรรมสิทธิ์ "ทรัพย์สินของบริษัท เจี่ยรักษา จำกัด จนกว่าชำระครบ" พร้อมหมายเลขเครื่องไว้ที่ตัวเครื่องและตู้ และจะนำป้ายออกให้เมื่อกรรมสิทธิ์โอนตามข้อ 3.2</w:t>
       </w:r>
     </w:p>
     <w:p>
@@ -1091,7 +1091,7 @@
           <w:sz w:val="32"/>
           <w:szCs w:val="32"/>
         </w:rPr>
-        <w:t xml:space="preserve">ผู้ให้เช่าซื้อจะส่งมอบทรัพย์สินที่เช่าซื้อ ณ สถานที่ติดตั้งตามข้อ 1.1 ภายใน ______ วันนับจากวันที่ได้รับเงินมัดจำ โดยไม่มีค่าขนส่งในเขต ________________</w:t>
+        <w:t xml:space="preserve">ผู้ให้เช่าซื้อจะส่งมอบทรัพย์สินที่เช่าซื้อ ณ สถานที่ติดตั้งตามข้อ 1.1 ภายใน ______ วันนับจากวันที่ได้รับเงินดาวน์ โดยไม่มีค่าขนส่งในเขต ________________</w:t>
       </w:r>
     </w:p>
     <w:p>
@@ -1323,7 +1323,7 @@
           <w:sz w:val="32"/>
           <w:szCs w:val="32"/>
         </w:rPr>
-        <w:t xml:space="preserve">ข้อ 6  การรับประกันและวัสดุสิ้นเปลือง</w:t>
+        <w:t xml:space="preserve">ข้อ 6  การรับประกัน วัสดุสิ้นเปลือง และข้อจำกัดความรับผิด</w:t>
       </w:r>
     </w:p>
     <w:p>
@@ -1423,24 +1423,57 @@
           <w:sz w:val="32"/>
           <w:szCs w:val="32"/>
         </w:rPr>
-        <w:t xml:space="preserve">[ตัวเลือก] หากเครื่องถูกใช้ช่วยชีวิตจริงและผู้เช่าซื้อแจ้งพร้อมหลักฐานภายใน 7 วัน ผู้ให้เช่าซื้อจะเปลี่ยนแผ่นอิเล็กโทรดให้ 1 ชุดโดยไม่คิดค่าใช้จ่าย</w:t>
-      </w:r>
-    </w:p>
-    <w:p>
-      <w:pPr>
-        <w:spacing w:after="80" w:line="300"/>
+        <w:t xml:space="preserve">หากเครื่องถูกใช้ช่วยชีวิตจริงและผู้เช่าซื้อแจ้งพร้อมหลักฐานภายใน 7 วัน ผู้ให้เช่าซื้อจะเปลี่ยนแผ่นอิเล็กโทรดให้ 1 ชุดโดยไม่คิดค่าใช้จ่าย</w:t>
+      </w:r>
+    </w:p>
+    <w:p>
+      <w:pPr>
+        <w:spacing w:after="80" w:line="300"/>
+        <w:ind w:left="567" w:hanging="567"/>
         <w:jc w:val="left"/>
       </w:pPr>
       <w:r>
         <w:rPr>
           <w:rFonts w:ascii="TH SarabunPSK" w:cs="TH SarabunPSK" w:eastAsia="TH SarabunPSK" w:hAnsi="TH SarabunPSK"/>
-          <w:i/>
-          <w:iCs/>
-          <w:color w:val="B00020"/>
-          <w:sz w:val="28"/>
-          <w:szCs w:val="28"/>
-        </w:rPr>
-        <w:t xml:space="preserve">หมายเหตุผู้ร่าง: ข้อ 6.4 นำมาจากสิทธิประโยชน์ของแผนเช่า หากไม่ให้กับเช่าซื้อให้ลบออก</w:t>
+          <w:b w:val="false"/>
+          <w:bCs w:val="false"/>
+          <w:sz w:val="32"/>
+          <w:szCs w:val="32"/>
+        </w:rPr>
+        <w:t xml:space="preserve">6.5 </w:t>
+      </w:r>
+      <w:r>
+        <w:rPr>
+          <w:rFonts w:ascii="TH SarabunPSK" w:cs="TH SarabunPSK" w:eastAsia="TH SarabunPSK" w:hAnsi="TH SarabunPSK"/>
+          <w:sz w:val="32"/>
+          <w:szCs w:val="32"/>
+        </w:rPr>
+        <w:t xml:space="preserve">ผู้ให้เช่าซื้อรับประกันตู้เก็บเครื่องเป็นเวลา 1 ปีนับจากวันส่งมอบ สำหรับความชำรุดบกพร่องจากการผลิตภายใต้การใช้งานตามปกติ</w:t>
+      </w:r>
+    </w:p>
+    <w:p>
+      <w:pPr>
+        <w:spacing w:after="80" w:line="300"/>
+        <w:ind w:left="567" w:hanging="567"/>
+        <w:jc w:val="left"/>
+      </w:pPr>
+      <w:r>
+        <w:rPr>
+          <w:rFonts w:ascii="TH SarabunPSK" w:cs="TH SarabunPSK" w:eastAsia="TH SarabunPSK" w:hAnsi="TH SarabunPSK"/>
+          <w:b w:val="false"/>
+          <w:bCs w:val="false"/>
+          <w:sz w:val="32"/>
+          <w:szCs w:val="32"/>
+        </w:rPr>
+        <w:t xml:space="preserve">6.6 </w:t>
+      </w:r>
+      <w:r>
+        <w:rPr>
+          <w:rFonts w:ascii="TH SarabunPSK" w:cs="TH SarabunPSK" w:eastAsia="TH SarabunPSK" w:hAnsi="TH SarabunPSK"/>
+          <w:sz w:val="32"/>
+          <w:szCs w:val="32"/>
+        </w:rPr>
+        <w:t xml:space="preserve">ผู้ให้เช่าซื้อไม่รับผิดต่อผลการรักษาหรือการรอดชีวิตของผู้ป่วย และไม่รับผิดต่อความเสียหายที่เกิดจากการใช้งานผิดไปจากคู่มือ การไม่ตรวจหรือไม่ดูแลความพร้อมของเครื่อง หรือการไม่เปลี่ยนวัสดุสิ้นเปลืองที่หมดอายุ ทั้งนี้ความรับผิดของผู้ให้เช่าซื้อตามสัญญานี้ไม่ว่ากรณีใดรวมกันไม่เกินราคาเช่าซื้อ เว้นแต่ความเสียหายเกิดจากการจงใจหรือประมาทเลินเล่ออย่างร้ายแรงของผู้ให้เช่าซื้อ</w:t>
       </w:r>
     </w:p>
     <w:p>
@@ -1481,24 +1514,7 @@
           <w:sz w:val="32"/>
           <w:szCs w:val="32"/>
         </w:rPr>
-        <w:t xml:space="preserve">หากผู้เช่าซื้อชำระค่าเช่าซื้องวดใดล่าช้า ผู้เช่าซื้อต้องชำระดอกเบี้ยผิดนัดในอัตราร้อยละ ______ ต่อปีของจำนวนที่ค้างชำระ นับแต่วันผิดนัดจนถึงวันชำระครบ</w:t>
-      </w:r>
-    </w:p>
-    <w:p>
-      <w:pPr>
-        <w:spacing w:after="80" w:line="300"/>
-        <w:jc w:val="left"/>
-      </w:pPr>
-      <w:r>
-        <w:rPr>
-          <w:rFonts w:ascii="TH SarabunPSK" w:cs="TH SarabunPSK" w:eastAsia="TH SarabunPSK" w:hAnsi="TH SarabunPSK"/>
-          <w:i/>
-          <w:iCs/>
-          <w:color w:val="B00020"/>
-          <w:sz w:val="28"/>
-          <w:szCs w:val="28"/>
-        </w:rPr>
-        <w:t xml:space="preserve">หมายเหตุผู้ร่าง: ถ้าไม่ระบุ ใช้อัตราตามกฎหมาย (ร้อยละ 5 ต่อปี) อัตราที่สูงเกินส่วนศาลอาจลดลงได้</w:t>
+        <w:t xml:space="preserve">หากผู้เช่าซื้อชำระค่าเช่าซื้องวดใดล่าช้า ผู้เช่าซื้อต้องชำระดอกเบี้ยผิดนัดในอัตราร้อยละ 15 ต่อปีของจำนวนที่ค้างชำระ นับแต่วันผิดนัดจนถึงวันชำระครบ และค่าติดตามทวงถามครั้งละ 200 บาท</w:t>
       </w:r>
     </w:p>
     <w:p>
@@ -1523,7 +1539,7 @@
           <w:sz w:val="32"/>
           <w:szCs w:val="32"/>
         </w:rPr>
-        <w:t xml:space="preserve">หากผู้เช่าซื้อผิดนัดไม่ชำระค่าเช่าซื้อสองคราวติด ๆ กัน หรือผิดสัญญาในข้อที่เป็นส่วนสำคัญ (ข้อ 5.3 หรือ 5.6) ผู้ให้เช่าซื้อมีสิทธิบอกเลิกสัญญาเป็นหนังสือ โดยให้เวลาผู้เช่าซื้อชำระหรือแก้ไขภายใน 15 วันนับจากวันได้รับหนังสือ หากไม่ปฏิบัติภายในกำหนด ให้ถือว่าสัญญาเลิกกันทันที</w:t>
+        <w:t xml:space="preserve">หากผู้เช่าซื้อผิดนัดไม่ชำระค่าเช่าซื้อสองคราวติด ๆ กัน หรือผิดสัญญาในข้อที่เป็นส่วนสำคัญ (ข้อ 5.3 หรือ 5.6) ผู้ให้เช่าซื้อมีสิทธิบอกเลิกสัญญาเป็นหนังสือ โดยให้เวลาผู้เช่าซื้อชำระหรือแก้ไขภายใน 15 วันนับจากวันได้รับหนังสือ หากไม่ปฏิบัติภายในกำหนด ให้ถือว่าสัญญาเลิกกันทันที ทั้งนี้ หากผู้เช่าซื้อเลิกกิจการ ถูกฟ้องล้มละลาย ถูกพิทักษ์ทรัพย์ หรือทรัพย์สินที่เช่าซื้อถูกยึดหรืออายัด ผู้ให้เช่าซื้อมีสิทธิบอกเลิกสัญญาได้ทันทีโดยไม่ต้องให้ระยะเวลาแก้ไข</w:t>
       </w:r>
     </w:p>
     <w:p>
@@ -1548,7 +1564,7 @@
           <w:sz w:val="32"/>
           <w:szCs w:val="32"/>
         </w:rPr>
-        <w:t xml:space="preserve">เมื่อสัญญาเลิกกันตามข้อ 7.2 ผู้เช่าซื้อต้องส่งคืนทรัพย์สินที่เช่าซื้อในสภาพที่ใช้งานได้ตามปกติภายใน 7 วัน หรือยินยอมให้ผู้ให้เช่าซื้อเข้ารับคืน ณ สถานที่ติดตั้ง เงินที่ผู้เช่าซื้อชำระมาแล้วทั้งหมดตกเป็นของผู้ให้เช่าซื้อ และผู้ให้เช่าซื้อมีสิทธิเรียกค่าเช่าซื้อที่ค้างชำระจนถึงวันเลิกสัญญา ทั้งนี้ผู้เช่าซื้อยินยอมให้ผู้ให้เช่าซื้อถอดตู้ที่ยึดติดกับอาคารออก โดยผู้ให้เช่าซื้อไม่ต้องรับผิดซ่อมแซมผนังหรือพื้นที่ติดตั้ง</w:t>
+        <w:t xml:space="preserve">เมื่อสัญญาเลิกกันตามข้อ 7.2 ผู้เช่าซื้อต้องส่งคืนทรัพย์สินที่เช่าซื้อในสภาพที่ใช้งานได้ตามปกติภายใน 7 วัน หรือยินยอมให้ผู้ให้เช่าซื้อเข้ารับคืน ณ สถานที่ติดตั้ง เงินที่ผู้เช่าซื้อชำระมาแล้วทั้งหมดตกเป็นของผู้ให้เช่าซื้อ และผู้ให้เช่าซื้อมีสิทธิเรียกค่าเช่าซื้อที่ค้างชำระจนถึงวันเลิกสัญญา ทั้งนี้ผู้เช่าซื้อยินยอมให้ผู้ให้เช่าซื้อถอดตู้ที่ยึดติดกับอาคารออก โดยผู้ให้เช่าซื้อไม่ต้องรับผิดซ่อมแซมผนังหรือพื้นที่ติดตั้ง หากผู้เช่าซื้อไม่ส่งคืนภายในกำหนด ผู้เช่าซื้อต้องชำระค่าขาดประโยชน์วันละ 200 บาท นับแต่วันครบกำหนดคืนจนถึงวันที่ส่งคืน และหากไม่สามารถส่งคืนได้ ต้องชดใช้ราคาทรัพย์สินเท่ากับราคาเช่าซื้อส่วนที่ยังค้างชำระ</w:t>
       </w:r>
     </w:p>
     <w:p>
@@ -1635,7 +1651,7 @@
           <w:sz w:val="32"/>
           <w:szCs w:val="32"/>
         </w:rPr>
-        <w:t xml:space="preserve">ผู้เช่าซื้อมีสิทธิชำระค่าเช่าซื้อส่วนที่เหลือทั้งหมดในคราวเดียวก่อนครบกำหนด โดยแจ้งผู้ให้เช่าซื้อล่วงหน้า และได้รับส่วนลด ______ (ระบุ หรือ "ไม่มีส่วนลด") เมื่อชำระครบให้กรรมสิทธิ์โอนตามข้อ 3.2</w:t>
+        <w:t xml:space="preserve">ผู้เช่าซื้อมีสิทธิชำระค่าเช่าซื้อส่วนที่เหลือทั้งหมดในคราวเดียวก่อนครบกำหนด โดยแจ้งผู้ให้เช่าซื้อล่วงหน้า โดยไม่มีส่วนลด เมื่อชำระครบให้กรรมสิทธิ์โอนตามข้อ 3.2</w:t>
       </w:r>
     </w:p>
     <w:p>
@@ -1769,7 +1785,7 @@
           <w:sz w:val="32"/>
           <w:szCs w:val="32"/>
         </w:rPr>
-        <w:t xml:space="preserve">อากรแสตมป์สำหรับสัญญานี้เป็นภาระของ ________________</w:t>
+        <w:t xml:space="preserve">อากรแสตมป์สำหรับสัญญานี้เป็นภาระของผู้เช่าซื้อ</w:t>
       </w:r>
     </w:p>
     <w:p>
@@ -2312,7 +2328,7 @@
                 <w:sz w:val="30"/>
                 <w:szCs w:val="30"/>
               </w:rPr>
-              <w:t xml:space="preserve">มัดจำ</w:t>
+              <w:t xml:space="preserve">ดาวน์</w:t>
             </w:r>
           </w:p>
         </w:tc>

</xml_diff>

<commit_message>
pricing: rent-to-own matches the signed contract — Y8 17,000 + 2,500×18 = 62,000, Y2 22,000 + 2,600→3,400×18 = 83,200, wall cabinet +6,000
Co-Authored-By: Claude Opus 5.5 <noreply@anthropic.com>
Claude-Session: https://claude.ai/code/session_01JgxTQRAtuSbhFJ3Hyi5Qsm
</commit_message>
<xml_diff>
--- a/docs/contracts/สัญญาเช่าซื้อ-AED-Y8.docx
+++ b/docs/contracts/สัญญาเช่าซื้อ-AED-Y8.docx
@@ -834,7 +834,7 @@
           <w:sz w:val="32"/>
           <w:szCs w:val="32"/>
         </w:rPr>
-        <w:t xml:space="preserve">ราคาเช่าซื้อทั้งสิ้น 58,000.00 บาท (ห้าหมื่นแปดพันบาทถ้วน) ยังไม่รวมภาษีมูลค่าเพิ่ม ประกอบด้วยค่าเครื่อง 52,000.00 บาท และค่าตู้เก็บเครื่อง 6,000.00 บาท ผู้เช่าซื้อตกลงชำระดังนี้</w:t>
+        <w:t xml:space="preserve">ราคาเช่าซื้อทั้งสิ้น 68,000.00 บาท (หกหมื่นแปดพันบาทถ้วน) ยังไม่รวมภาษีมูลค่าเพิ่ม ประกอบด้วยค่าเครื่อง 62,000.00 บาท และค่าตู้เก็บเครื่อง 6,000.00 บาท ผู้เช่าซื้อตกลงชำระดังนี้</w:t>
       </w:r>
     </w:p>
     <w:p>
@@ -859,7 +859,7 @@
           <w:sz w:val="32"/>
           <w:szCs w:val="32"/>
         </w:rPr>
-        <w:t xml:space="preserve">(ก) เงินดาวน์ (ค่าเช่าซื้องวดแรก) 16,600.00 บาท ชำระในวันทำสัญญา เป็นส่วนหนึ่งของราคาเช่าซื้อ มิใช่มัดจำหรือเงินประกัน</w:t>
+        <w:t xml:space="preserve">(ก) เงินดาวน์ (ค่าเช่าซื้องวดแรก) 15,800.00 บาท ชำระในวันทำสัญญา เป็นส่วนหนึ่งของราคาเช่าซื้อ มิใช่มัดจำหรือเงินประกัน</w:t>
       </w:r>
     </w:p>
     <w:p>
@@ -884,7 +884,7 @@
           <w:sz w:val="32"/>
           <w:szCs w:val="32"/>
         </w:rPr>
-        <w:t xml:space="preserve">(ข) ค่าเช่าซื้อรายเดือน 18 งวด งวดละ 2,300.00 บาท ชำระภายในวันที่ ______ ของทุกเดือน เริ่มงวดแรกวันที่ ______________ และงวดสุดท้ายวันที่ ______________ ตามตารางการชำระเงินในเอกสารแนบ 1</w:t>
+        <w:t xml:space="preserve">(ข) ค่าเช่าซื้อรายเดือน 18 งวด งวดละ 2,900.00 บาท ชำระภายในวันที่ ______ ของทุกเดือน เริ่มงวดแรกวันที่ ______________ และงวดสุดท้ายวันที่ ______________ ตามตารางการชำระเงินในเอกสารแนบ 1</w:t>
       </w:r>
     </w:p>
     <w:p>
@@ -2392,7 +2392,7 @@
                 <w:sz w:val="30"/>
                 <w:szCs w:val="30"/>
               </w:rPr>
-              <w:t xml:space="preserve">16,600.00</w:t>
+              <w:t xml:space="preserve">15,800.00</w:t>
             </w:r>
           </w:p>
         </w:tc>
@@ -2424,7 +2424,7 @@
                 <w:sz w:val="30"/>
                 <w:szCs w:val="30"/>
               </w:rPr>
-              <w:t xml:space="preserve">1,162.00</w:t>
+              <w:t xml:space="preserve">1,106.00</w:t>
             </w:r>
           </w:p>
         </w:tc>
@@ -2456,7 +2456,7 @@
                 <w:sz w:val="30"/>
                 <w:szCs w:val="30"/>
               </w:rPr>
-              <w:t xml:space="preserve">17,762.00</w:t>
+              <w:t xml:space="preserve">16,906.00</w:t>
             </w:r>
           </w:p>
         </w:tc>
@@ -2557,7 +2557,7 @@
                 <w:sz w:val="30"/>
                 <w:szCs w:val="30"/>
               </w:rPr>
-              <w:t xml:space="preserve">2,300.00</w:t>
+              <w:t xml:space="preserve">2,900.00</w:t>
             </w:r>
           </w:p>
         </w:tc>
@@ -2589,7 +2589,7 @@
                 <w:sz w:val="30"/>
                 <w:szCs w:val="30"/>
               </w:rPr>
-              <w:t xml:space="preserve">161.00</w:t>
+              <w:t xml:space="preserve">203.00</w:t>
             </w:r>
           </w:p>
         </w:tc>
@@ -2621,7 +2621,7 @@
                 <w:sz w:val="30"/>
                 <w:szCs w:val="30"/>
               </w:rPr>
-              <w:t xml:space="preserve">2,461.00</w:t>
+              <w:t xml:space="preserve">3,103.00</w:t>
             </w:r>
           </w:p>
         </w:tc>
@@ -2722,7 +2722,7 @@
                 <w:sz w:val="30"/>
                 <w:szCs w:val="30"/>
               </w:rPr>
-              <w:t xml:space="preserve">2,300.00</w:t>
+              <w:t xml:space="preserve">2,900.00</w:t>
             </w:r>
           </w:p>
         </w:tc>
@@ -2754,7 +2754,7 @@
                 <w:sz w:val="30"/>
                 <w:szCs w:val="30"/>
               </w:rPr>
-              <w:t xml:space="preserve">161.00</w:t>
+              <w:t xml:space="preserve">203.00</w:t>
             </w:r>
           </w:p>
         </w:tc>
@@ -2786,7 +2786,7 @@
                 <w:sz w:val="30"/>
                 <w:szCs w:val="30"/>
               </w:rPr>
-              <w:t xml:space="preserve">2,461.00</w:t>
+              <w:t xml:space="preserve">3,103.00</w:t>
             </w:r>
           </w:p>
         </w:tc>
@@ -2887,7 +2887,7 @@
                 <w:sz w:val="30"/>
                 <w:szCs w:val="30"/>
               </w:rPr>
-              <w:t xml:space="preserve">2,300.00</w:t>
+              <w:t xml:space="preserve">2,900.00</w:t>
             </w:r>
           </w:p>
         </w:tc>
@@ -2919,7 +2919,7 @@
                 <w:sz w:val="30"/>
                 <w:szCs w:val="30"/>
               </w:rPr>
-              <w:t xml:space="preserve">161.00</w:t>
+              <w:t xml:space="preserve">203.00</w:t>
             </w:r>
           </w:p>
         </w:tc>
@@ -2951,7 +2951,7 @@
                 <w:sz w:val="30"/>
                 <w:szCs w:val="30"/>
               </w:rPr>
-              <w:t xml:space="preserve">2,461.00</w:t>
+              <w:t xml:space="preserve">3,103.00</w:t>
             </w:r>
           </w:p>
         </w:tc>
@@ -3052,7 +3052,7 @@
                 <w:sz w:val="30"/>
                 <w:szCs w:val="30"/>
               </w:rPr>
-              <w:t xml:space="preserve">2,300.00</w:t>
+              <w:t xml:space="preserve">2,900.00</w:t>
             </w:r>
           </w:p>
         </w:tc>
@@ -3084,7 +3084,7 @@
                 <w:sz w:val="30"/>
                 <w:szCs w:val="30"/>
               </w:rPr>
-              <w:t xml:space="preserve">161.00</w:t>
+              <w:t xml:space="preserve">203.00</w:t>
             </w:r>
           </w:p>
         </w:tc>
@@ -3116,7 +3116,7 @@
                 <w:sz w:val="30"/>
                 <w:szCs w:val="30"/>
               </w:rPr>
-              <w:t xml:space="preserve">2,461.00</w:t>
+              <w:t xml:space="preserve">3,103.00</w:t>
             </w:r>
           </w:p>
         </w:tc>
@@ -3217,7 +3217,7 @@
                 <w:sz w:val="30"/>
                 <w:szCs w:val="30"/>
               </w:rPr>
-              <w:t xml:space="preserve">2,300.00</w:t>
+              <w:t xml:space="preserve">2,900.00</w:t>
             </w:r>
           </w:p>
         </w:tc>
@@ -3249,7 +3249,7 @@
                 <w:sz w:val="30"/>
                 <w:szCs w:val="30"/>
               </w:rPr>
-              <w:t xml:space="preserve">161.00</w:t>
+              <w:t xml:space="preserve">203.00</w:t>
             </w:r>
           </w:p>
         </w:tc>
@@ -3281,7 +3281,7 @@
                 <w:sz w:val="30"/>
                 <w:szCs w:val="30"/>
               </w:rPr>
-              <w:t xml:space="preserve">2,461.00</w:t>
+              <w:t xml:space="preserve">3,103.00</w:t>
             </w:r>
           </w:p>
         </w:tc>
@@ -3382,7 +3382,7 @@
                 <w:sz w:val="30"/>
                 <w:szCs w:val="30"/>
               </w:rPr>
-              <w:t xml:space="preserve">2,300.00</w:t>
+              <w:t xml:space="preserve">2,900.00</w:t>
             </w:r>
           </w:p>
         </w:tc>
@@ -3414,7 +3414,7 @@
                 <w:sz w:val="30"/>
                 <w:szCs w:val="30"/>
               </w:rPr>
-              <w:t xml:space="preserve">161.00</w:t>
+              <w:t xml:space="preserve">203.00</w:t>
             </w:r>
           </w:p>
         </w:tc>
@@ -3446,7 +3446,7 @@
                 <w:sz w:val="30"/>
                 <w:szCs w:val="30"/>
               </w:rPr>
-              <w:t xml:space="preserve">2,461.00</w:t>
+              <w:t xml:space="preserve">3,103.00</w:t>
             </w:r>
           </w:p>
         </w:tc>
@@ -3547,7 +3547,7 @@
                 <w:sz w:val="30"/>
                 <w:szCs w:val="30"/>
               </w:rPr>
-              <w:t xml:space="preserve">2,300.00</w:t>
+              <w:t xml:space="preserve">2,900.00</w:t>
             </w:r>
           </w:p>
         </w:tc>
@@ -3579,7 +3579,7 @@
                 <w:sz w:val="30"/>
                 <w:szCs w:val="30"/>
               </w:rPr>
-              <w:t xml:space="preserve">161.00</w:t>
+              <w:t xml:space="preserve">203.00</w:t>
             </w:r>
           </w:p>
         </w:tc>
@@ -3611,7 +3611,7 @@
                 <w:sz w:val="30"/>
                 <w:szCs w:val="30"/>
               </w:rPr>
-              <w:t xml:space="preserve">2,461.00</w:t>
+              <w:t xml:space="preserve">3,103.00</w:t>
             </w:r>
           </w:p>
         </w:tc>
@@ -3712,7 +3712,7 @@
                 <w:sz w:val="30"/>
                 <w:szCs w:val="30"/>
               </w:rPr>
-              <w:t xml:space="preserve">2,300.00</w:t>
+              <w:t xml:space="preserve">2,900.00</w:t>
             </w:r>
           </w:p>
         </w:tc>
@@ -3744,7 +3744,7 @@
                 <w:sz w:val="30"/>
                 <w:szCs w:val="30"/>
               </w:rPr>
-              <w:t xml:space="preserve">161.00</w:t>
+              <w:t xml:space="preserve">203.00</w:t>
             </w:r>
           </w:p>
         </w:tc>
@@ -3776,7 +3776,7 @@
                 <w:sz w:val="30"/>
                 <w:szCs w:val="30"/>
               </w:rPr>
-              <w:t xml:space="preserve">2,461.00</w:t>
+              <w:t xml:space="preserve">3,103.00</w:t>
             </w:r>
           </w:p>
         </w:tc>
@@ -3877,7 +3877,7 @@
                 <w:sz w:val="30"/>
                 <w:szCs w:val="30"/>
               </w:rPr>
-              <w:t xml:space="preserve">2,300.00</w:t>
+              <w:t xml:space="preserve">2,900.00</w:t>
             </w:r>
           </w:p>
         </w:tc>
@@ -3909,7 +3909,7 @@
                 <w:sz w:val="30"/>
                 <w:szCs w:val="30"/>
               </w:rPr>
-              <w:t xml:space="preserve">161.00</w:t>
+              <w:t xml:space="preserve">203.00</w:t>
             </w:r>
           </w:p>
         </w:tc>
@@ -3941,7 +3941,7 @@
                 <w:sz w:val="30"/>
                 <w:szCs w:val="30"/>
               </w:rPr>
-              <w:t xml:space="preserve">2,461.00</w:t>
+              <w:t xml:space="preserve">3,103.00</w:t>
             </w:r>
           </w:p>
         </w:tc>
@@ -4042,7 +4042,7 @@
                 <w:sz w:val="30"/>
                 <w:szCs w:val="30"/>
               </w:rPr>
-              <w:t xml:space="preserve">2,300.00</w:t>
+              <w:t xml:space="preserve">2,900.00</w:t>
             </w:r>
           </w:p>
         </w:tc>
@@ -4074,7 +4074,7 @@
                 <w:sz w:val="30"/>
                 <w:szCs w:val="30"/>
               </w:rPr>
-              <w:t xml:space="preserve">161.00</w:t>
+              <w:t xml:space="preserve">203.00</w:t>
             </w:r>
           </w:p>
         </w:tc>
@@ -4106,7 +4106,7 @@
                 <w:sz w:val="30"/>
                 <w:szCs w:val="30"/>
               </w:rPr>
-              <w:t xml:space="preserve">2,461.00</w:t>
+              <w:t xml:space="preserve">3,103.00</w:t>
             </w:r>
           </w:p>
         </w:tc>
@@ -4207,7 +4207,7 @@
                 <w:sz w:val="30"/>
                 <w:szCs w:val="30"/>
               </w:rPr>
-              <w:t xml:space="preserve">2,300.00</w:t>
+              <w:t xml:space="preserve">2,900.00</w:t>
             </w:r>
           </w:p>
         </w:tc>
@@ -4239,7 +4239,7 @@
                 <w:sz w:val="30"/>
                 <w:szCs w:val="30"/>
               </w:rPr>
-              <w:t xml:space="preserve">161.00</w:t>
+              <w:t xml:space="preserve">203.00</w:t>
             </w:r>
           </w:p>
         </w:tc>
@@ -4271,7 +4271,7 @@
                 <w:sz w:val="30"/>
                 <w:szCs w:val="30"/>
               </w:rPr>
-              <w:t xml:space="preserve">2,461.00</w:t>
+              <w:t xml:space="preserve">3,103.00</w:t>
             </w:r>
           </w:p>
         </w:tc>
@@ -4372,7 +4372,7 @@
                 <w:sz w:val="30"/>
                 <w:szCs w:val="30"/>
               </w:rPr>
-              <w:t xml:space="preserve">2,300.00</w:t>
+              <w:t xml:space="preserve">2,900.00</w:t>
             </w:r>
           </w:p>
         </w:tc>
@@ -4404,7 +4404,7 @@
                 <w:sz w:val="30"/>
                 <w:szCs w:val="30"/>
               </w:rPr>
-              <w:t xml:space="preserve">161.00</w:t>
+              <w:t xml:space="preserve">203.00</w:t>
             </w:r>
           </w:p>
         </w:tc>
@@ -4436,7 +4436,7 @@
                 <w:sz w:val="30"/>
                 <w:szCs w:val="30"/>
               </w:rPr>
-              <w:t xml:space="preserve">2,461.00</w:t>
+              <w:t xml:space="preserve">3,103.00</w:t>
             </w:r>
           </w:p>
         </w:tc>
@@ -4537,7 +4537,7 @@
                 <w:sz w:val="30"/>
                 <w:szCs w:val="30"/>
               </w:rPr>
-              <w:t xml:space="preserve">2,300.00</w:t>
+              <w:t xml:space="preserve">2,900.00</w:t>
             </w:r>
           </w:p>
         </w:tc>
@@ -4569,7 +4569,7 @@
                 <w:sz w:val="30"/>
                 <w:szCs w:val="30"/>
               </w:rPr>
-              <w:t xml:space="preserve">161.00</w:t>
+              <w:t xml:space="preserve">203.00</w:t>
             </w:r>
           </w:p>
         </w:tc>
@@ -4601,7 +4601,7 @@
                 <w:sz w:val="30"/>
                 <w:szCs w:val="30"/>
               </w:rPr>
-              <w:t xml:space="preserve">2,461.00</w:t>
+              <w:t xml:space="preserve">3,103.00</w:t>
             </w:r>
           </w:p>
         </w:tc>
@@ -4702,7 +4702,7 @@
                 <w:sz w:val="30"/>
                 <w:szCs w:val="30"/>
               </w:rPr>
-              <w:t xml:space="preserve">2,300.00</w:t>
+              <w:t xml:space="preserve">2,900.00</w:t>
             </w:r>
           </w:p>
         </w:tc>
@@ -4734,7 +4734,7 @@
                 <w:sz w:val="30"/>
                 <w:szCs w:val="30"/>
               </w:rPr>
-              <w:t xml:space="preserve">161.00</w:t>
+              <w:t xml:space="preserve">203.00</w:t>
             </w:r>
           </w:p>
         </w:tc>
@@ -4766,7 +4766,7 @@
                 <w:sz w:val="30"/>
                 <w:szCs w:val="30"/>
               </w:rPr>
-              <w:t xml:space="preserve">2,461.00</w:t>
+              <w:t xml:space="preserve">3,103.00</w:t>
             </w:r>
           </w:p>
         </w:tc>
@@ -4867,7 +4867,7 @@
                 <w:sz w:val="30"/>
                 <w:szCs w:val="30"/>
               </w:rPr>
-              <w:t xml:space="preserve">2,300.00</w:t>
+              <w:t xml:space="preserve">2,900.00</w:t>
             </w:r>
           </w:p>
         </w:tc>
@@ -4899,7 +4899,7 @@
                 <w:sz w:val="30"/>
                 <w:szCs w:val="30"/>
               </w:rPr>
-              <w:t xml:space="preserve">161.00</w:t>
+              <w:t xml:space="preserve">203.00</w:t>
             </w:r>
           </w:p>
         </w:tc>
@@ -4931,7 +4931,7 @@
                 <w:sz w:val="30"/>
                 <w:szCs w:val="30"/>
               </w:rPr>
-              <w:t xml:space="preserve">2,461.00</w:t>
+              <w:t xml:space="preserve">3,103.00</w:t>
             </w:r>
           </w:p>
         </w:tc>
@@ -5032,7 +5032,7 @@
                 <w:sz w:val="30"/>
                 <w:szCs w:val="30"/>
               </w:rPr>
-              <w:t xml:space="preserve">2,300.00</w:t>
+              <w:t xml:space="preserve">2,900.00</w:t>
             </w:r>
           </w:p>
         </w:tc>
@@ -5064,7 +5064,7 @@
                 <w:sz w:val="30"/>
                 <w:szCs w:val="30"/>
               </w:rPr>
-              <w:t xml:space="preserve">161.00</w:t>
+              <w:t xml:space="preserve">203.00</w:t>
             </w:r>
           </w:p>
         </w:tc>
@@ -5096,7 +5096,7 @@
                 <w:sz w:val="30"/>
                 <w:szCs w:val="30"/>
               </w:rPr>
-              <w:t xml:space="preserve">2,461.00</w:t>
+              <w:t xml:space="preserve">3,103.00</w:t>
             </w:r>
           </w:p>
         </w:tc>
@@ -5197,7 +5197,7 @@
                 <w:sz w:val="30"/>
                 <w:szCs w:val="30"/>
               </w:rPr>
-              <w:t xml:space="preserve">2,300.00</w:t>
+              <w:t xml:space="preserve">2,900.00</w:t>
             </w:r>
           </w:p>
         </w:tc>
@@ -5229,7 +5229,7 @@
                 <w:sz w:val="30"/>
                 <w:szCs w:val="30"/>
               </w:rPr>
-              <w:t xml:space="preserve">161.00</w:t>
+              <w:t xml:space="preserve">203.00</w:t>
             </w:r>
           </w:p>
         </w:tc>
@@ -5261,7 +5261,7 @@
                 <w:sz w:val="30"/>
                 <w:szCs w:val="30"/>
               </w:rPr>
-              <w:t xml:space="preserve">2,461.00</w:t>
+              <w:t xml:space="preserve">3,103.00</w:t>
             </w:r>
           </w:p>
         </w:tc>
@@ -5362,7 +5362,7 @@
                 <w:sz w:val="30"/>
                 <w:szCs w:val="30"/>
               </w:rPr>
-              <w:t xml:space="preserve">2,300.00</w:t>
+              <w:t xml:space="preserve">2,900.00</w:t>
             </w:r>
           </w:p>
         </w:tc>
@@ -5394,7 +5394,7 @@
                 <w:sz w:val="30"/>
                 <w:szCs w:val="30"/>
               </w:rPr>
-              <w:t xml:space="preserve">161.00</w:t>
+              <w:t xml:space="preserve">203.00</w:t>
             </w:r>
           </w:p>
         </w:tc>
@@ -5426,7 +5426,7 @@
                 <w:sz w:val="30"/>
                 <w:szCs w:val="30"/>
               </w:rPr>
-              <w:t xml:space="preserve">2,461.00</w:t>
+              <w:t xml:space="preserve">3,103.00</w:t>
             </w:r>
           </w:p>
         </w:tc>
@@ -5527,7 +5527,7 @@
                 <w:sz w:val="30"/>
                 <w:szCs w:val="30"/>
               </w:rPr>
-              <w:t xml:space="preserve">58,000.00</w:t>
+              <w:t xml:space="preserve">68,000.00</w:t>
             </w:r>
           </w:p>
         </w:tc>
@@ -5559,7 +5559,7 @@
                 <w:sz w:val="30"/>
                 <w:szCs w:val="30"/>
               </w:rPr>
-              <w:t xml:space="preserve">4,060.00</w:t>
+              <w:t xml:space="preserve">4,760.00</w:t>
             </w:r>
           </w:p>
         </w:tc>
@@ -5591,7 +5591,7 @@
                 <w:sz w:val="30"/>
                 <w:szCs w:val="30"/>
               </w:rPr>
-              <w:t xml:space="preserve">62,060.00</w:t>
+              <w:t xml:space="preserve">72,760.00</w:t>
             </w:r>
           </w:p>
         </w:tc>
@@ -5611,7 +5611,7 @@
           <w:sz w:val="28"/>
           <w:szCs w:val="28"/>
         </w:rPr>
-        <w:t xml:space="preserve">หมายเหตุผู้ร่าง: ตารางนี้คิด VAT 7% เพิ่มจากราคา ฿58,000 (ถือว่าราคาที่ประกาศยังไม่รวม VAT) หากราคาที่ตกลงกับลูกค้ารวม VAT แล้ว ให้แก้ข้อ 2 และตารางนี้</w:t>
+        <w:t xml:space="preserve">หมายเหตุผู้ร่าง: ตารางนี้คิด VAT 7% เพิ่มจากราคา ฿68,000 (ถือว่าราคาที่ประกาศยังไม่รวม VAT) หากราคาที่ตกลงกับลูกค้ารวม VAT แล้ว ให้แก้ข้อ 2 และตารางนี้</w:t>
       </w:r>
     </w:p>
     <w:p>
@@ -6882,7 +6882,7 @@
           <w:sz w:val="32"/>
           <w:szCs w:val="32"/>
         </w:rPr>
-        <w:t xml:space="preserve">ผู้ค้ำประกันรับผิดในวงเงินไม่เกิน 62,060.00 บาท (ราคาเช่าซื้อรวมภาษีมูลค่าเพิ่ม) พร้อมดอกเบี้ยผิดนัดและค่าใช้จ่ายในการติดตามทวงถามตามจริง</w:t>
+        <w:t xml:space="preserve">ผู้ค้ำประกันรับผิดในวงเงินไม่เกิน 72,760.00 บาท (ราคาเช่าซื้อรวมภาษีมูลค่าเพิ่ม) พร้อมดอกเบี้ยผิดนัดและค่าใช้จ่ายในการติดตามทวงถามตามจริง</w:t>
       </w:r>
     </w:p>
     <w:p>

</xml_diff>

<commit_message>
rent-to-own Y8 ships as the GPS unit, disclosed: remote readiness monitoring replaces 6-monthly site visits
Site cards, bots, sample contract and the contract template now say Y8 GPS;
monitoring stops at ownership transfer unless the customer opts in. Template
also gains clause 4.4 (training).

Co-Authored-By: Claude Opus 5.5 <noreply@anthropic.com>
Claude-Session: https://claude.ai/code/session_01JgxTQRAtuSbhFJ3Hyi5Qsm
</commit_message>
<xml_diff>
--- a/docs/contracts/สัญญาเช่าซื้อ-AED-Y8.docx
+++ b/docs/contracts/สัญญาเช่าซื้อ-AED-Y8.docx
@@ -435,7 +435,7 @@
                 <w:sz w:val="30"/>
                 <w:szCs w:val="30"/>
               </w:rPr>
-              <w:t xml:space="preserve">Yuwell (PRIMEDIC HeartSave) รุ่น Y8 พร้อมเซ็นเซอร์ CPR feedback</w:t>
+              <w:t xml:space="preserve">Yuwell (PRIMEDIC HeartSave) รุ่น Y8 พร้อมเซ็นเซอร์ CPR feedback และ GPS ในตัว</w:t>
             </w:r>
           </w:p>
         </w:tc>
@@ -472,7 +472,7 @@
                 <w:sz w:val="30"/>
                 <w:szCs w:val="30"/>
               </w:rPr>
-              <w:t xml:space="preserve">หมายเลขเครื่อง (S/N)</w:t>
+              <w:t xml:space="preserve">ระบบตรวจสอบ</w:t>
             </w:r>
           </w:p>
         </w:tc>
@@ -504,7 +504,7 @@
                 <w:sz w:val="30"/>
                 <w:szCs w:val="30"/>
               </w:rPr>
-              <w:t xml:space="preserve">________________________________</w:t>
+              <w:t xml:space="preserve">GPS และระบบตรวจสอบตำแหน่ง/สถานะความพร้อมของเครื่องแบบออนไลน์ ติดตั้งในตัวเครื่อง</w:t>
             </w:r>
           </w:p>
         </w:tc>
@@ -541,7 +541,7 @@
                 <w:sz w:val="30"/>
                 <w:szCs w:val="30"/>
               </w:rPr>
-              <w:t xml:space="preserve">อุปกรณ์ที่ส่งมอบพร้อมเครื่อง</w:t>
+              <w:t xml:space="preserve">หมายเลขเครื่อง (S/N)</w:t>
             </w:r>
           </w:p>
         </w:tc>
@@ -573,37 +573,7 @@
                 <w:sz w:val="30"/>
                 <w:szCs w:val="30"/>
               </w:rPr>
-              <w:t xml:space="preserve">แผ่นอิเล็กโทรดสำหรับผู้ใหญ่ 1 ชุด (Lot/วันหมดอายุ ________________)</w:t>
-            </w:r>
-          </w:p>
-          <w:p>
-            <w:pPr>
-              <w:jc w:val="left"/>
-            </w:pPr>
-            <w:r>
-              <w:rPr>
-                <w:rFonts w:ascii="TH SarabunPSK" w:cs="TH SarabunPSK" w:eastAsia="TH SarabunPSK" w:hAnsi="TH SarabunPSK"/>
-                <w:b w:val="false"/>
-                <w:bCs w:val="false"/>
-                <w:sz w:val="30"/>
-                <w:szCs w:val="30"/>
-              </w:rPr>
-              <w:t xml:space="preserve">แบตเตอรี่ 1 ก้อน (Lot/วันหมดอายุ ________________)</w:t>
-            </w:r>
-          </w:p>
-          <w:p>
-            <w:pPr>
-              <w:jc w:val="left"/>
-            </w:pPr>
-            <w:r>
-              <w:rPr>
-                <w:rFonts w:ascii="TH SarabunPSK" w:cs="TH SarabunPSK" w:eastAsia="TH SarabunPSK" w:hAnsi="TH SarabunPSK"/>
-                <w:b w:val="false"/>
-                <w:bCs w:val="false"/>
-                <w:sz w:val="30"/>
-                <w:szCs w:val="30"/>
-              </w:rPr>
-              <w:t xml:space="preserve">กระเป๋าใส่เครื่อง และคู่มือการใช้งานภาษาไทย</w:t>
+              <w:t xml:space="preserve">________________________________</w:t>
             </w:r>
           </w:p>
         </w:tc>
@@ -640,7 +610,7 @@
                 <w:sz w:val="30"/>
                 <w:szCs w:val="30"/>
               </w:rPr>
-              <w:t xml:space="preserve">ตู้เก็บเครื่อง AED</w:t>
+              <w:t xml:space="preserve">อุปกรณ์ที่ส่งมอบพร้อมเครื่อง</w:t>
             </w:r>
           </w:p>
         </w:tc>
@@ -672,7 +642,37 @@
                 <w:sz w:val="30"/>
                 <w:szCs w:val="30"/>
               </w:rPr>
-              <w:t xml:space="preserve">ตู้ ☐ ติดผนัง ☐ ตั้งพื้น  ยี่ห้อ/รุ่น ________________</w:t>
+              <w:t xml:space="preserve">แผ่นอิเล็กโทรดสำหรับผู้ใหญ่ 1 ชุด (Lot/วันหมดอายุ ________________)</w:t>
+            </w:r>
+          </w:p>
+          <w:p>
+            <w:pPr>
+              <w:jc w:val="left"/>
+            </w:pPr>
+            <w:r>
+              <w:rPr>
+                <w:rFonts w:ascii="TH SarabunPSK" w:cs="TH SarabunPSK" w:eastAsia="TH SarabunPSK" w:hAnsi="TH SarabunPSK"/>
+                <w:b w:val="false"/>
+                <w:bCs w:val="false"/>
+                <w:sz w:val="30"/>
+                <w:szCs w:val="30"/>
+              </w:rPr>
+              <w:t xml:space="preserve">แบตเตอรี่ 1 ก้อน (Lot/วันหมดอายุ ________________)</w:t>
+            </w:r>
+          </w:p>
+          <w:p>
+            <w:pPr>
+              <w:jc w:val="left"/>
+            </w:pPr>
+            <w:r>
+              <w:rPr>
+                <w:rFonts w:ascii="TH SarabunPSK" w:cs="TH SarabunPSK" w:eastAsia="TH SarabunPSK" w:hAnsi="TH SarabunPSK"/>
+                <w:b w:val="false"/>
+                <w:bCs w:val="false"/>
+                <w:sz w:val="30"/>
+                <w:szCs w:val="30"/>
+              </w:rPr>
+              <w:t xml:space="preserve">กระเป๋าใส่เครื่อง และคู่มือการใช้งานภาษาไทย</w:t>
             </w:r>
           </w:p>
         </w:tc>
@@ -709,6 +709,75 @@
                 <w:sz w:val="30"/>
                 <w:szCs w:val="30"/>
               </w:rPr>
+              <w:t xml:space="preserve">ตู้เก็บเครื่อง AED</w:t>
+            </w:r>
+          </w:p>
+        </w:tc>
+        <w:tc>
+          <w:tcPr>
+            <w:tcW w:type="dxa" w:w="6400"/>
+            <w:tcBorders>
+              <w:top w:val="single" w:color="808080" w:sz="4"/>
+              <w:left w:val="single" w:color="808080" w:sz="4"/>
+              <w:bottom w:val="single" w:color="808080" w:sz="4"/>
+              <w:right w:val="single" w:color="808080" w:sz="4"/>
+            </w:tcBorders>
+            <w:tcMar>
+              <w:top w:type="dxa" w:w="60"/>
+              <w:left w:type="dxa" w:w="100"/>
+              <w:bottom w:type="dxa" w:w="60"/>
+              <w:right w:type="dxa" w:w="100"/>
+            </w:tcMar>
+          </w:tcPr>
+          <w:p>
+            <w:pPr>
+              <w:jc w:val="left"/>
+            </w:pPr>
+            <w:r>
+              <w:rPr>
+                <w:rFonts w:ascii="TH SarabunPSK" w:cs="TH SarabunPSK" w:eastAsia="TH SarabunPSK" w:hAnsi="TH SarabunPSK"/>
+                <w:b w:val="false"/>
+                <w:bCs w:val="false"/>
+                <w:sz w:val="30"/>
+                <w:szCs w:val="30"/>
+              </w:rPr>
+              <w:t xml:space="preserve">ตู้ ☐ ติดผนัง ☐ ตั้งพื้น  ยี่ห้อ/รุ่น ________________</w:t>
+            </w:r>
+          </w:p>
+        </w:tc>
+      </w:tr>
+      <w:tr>
+        <w:trPr>
+          <w:tblHeader w:val="false"/>
+        </w:trPr>
+        <w:tc>
+          <w:tcPr>
+            <w:tcW w:type="dxa" w:w="2600"/>
+            <w:tcBorders>
+              <w:top w:val="single" w:color="808080" w:sz="4"/>
+              <w:left w:val="single" w:color="808080" w:sz="4"/>
+              <w:bottom w:val="single" w:color="808080" w:sz="4"/>
+              <w:right w:val="single" w:color="808080" w:sz="4"/>
+            </w:tcBorders>
+            <w:tcMar>
+              <w:top w:type="dxa" w:w="60"/>
+              <w:left w:type="dxa" w:w="100"/>
+              <w:bottom w:type="dxa" w:w="60"/>
+              <w:right w:type="dxa" w:w="100"/>
+            </w:tcMar>
+          </w:tcPr>
+          <w:p>
+            <w:pPr>
+              <w:jc w:val="left"/>
+            </w:pPr>
+            <w:r>
+              <w:rPr>
+                <w:rFonts w:ascii="TH SarabunPSK" w:cs="TH SarabunPSK" w:eastAsia="TH SarabunPSK" w:hAnsi="TH SarabunPSK"/>
+                <w:b w:val="false"/>
+                <w:bCs w:val="false"/>
+                <w:sz w:val="30"/>
+                <w:szCs w:val="30"/>
+              </w:rPr>
               <w:t xml:space="preserve">สถานที่ติดตั้ง</w:t>
             </w:r>
           </w:p>
@@ -1025,7 +1094,7 @@
           <w:sz w:val="32"/>
           <w:szCs w:val="32"/>
         </w:rPr>
-        <w:t xml:space="preserve">เมื่อผู้เช่าซื้อชำระครบถ้วนแล้ว ทรัพย์สินที่เช่าซื้อตกเป็นกรรมสิทธิ์ของผู้เช่าซื้อทันทีโดยไม่มีค่าใช้จ่ายเพิ่ม และผู้ให้เช่าซื้อจะออกหนังสือยืนยันการโอนกรรมสิทธิ์ให้ภายใน 15 วัน</w:t>
+        <w:t xml:space="preserve">เมื่อผู้เช่าซื้อชำระครบถ้วนแล้ว ทรัพย์สินที่เช่าซื้อตกเป็นกรรมสิทธิ์ของผู้เช่าซื้อทันทีโดยไม่มีค่าใช้จ่ายเพิ่ม ผู้ให้เช่าซื้อจะออกหนังสือยืนยันการโอนกรรมสิทธิ์ให้ภายใน 15 วัน และหยุดรับข้อมูลตำแหน่งของเครื่อง เว้นแต่ผู้เช่าซื้อเลือกใช้บริการแจ้งเตือนสถานะต่อ</w:t>
       </w:r>
     </w:p>
     <w:p>
@@ -1146,6 +1215,31 @@
     </w:p>
     <w:p>
       <w:pPr>
+        <w:spacing w:after="80" w:line="300"/>
+        <w:ind w:left="567" w:hanging="567"/>
+        <w:jc w:val="left"/>
+      </w:pPr>
+      <w:r>
+        <w:rPr>
+          <w:rFonts w:ascii="TH SarabunPSK" w:cs="TH SarabunPSK" w:eastAsia="TH SarabunPSK" w:hAnsi="TH SarabunPSK"/>
+          <w:b w:val="false"/>
+          <w:bCs w:val="false"/>
+          <w:sz w:val="32"/>
+          <w:szCs w:val="32"/>
+        </w:rPr>
+        <w:t xml:space="preserve">4.4 </w:t>
+      </w:r>
+      <w:r>
+        <w:rPr>
+          <w:rFonts w:ascii="TH SarabunPSK" w:cs="TH SarabunPSK" w:eastAsia="TH SarabunPSK" w:hAnsi="TH SarabunPSK"/>
+          <w:sz w:val="32"/>
+          <w:szCs w:val="32"/>
+        </w:rPr>
+        <w:t xml:space="preserve">ผู้ให้เช่าซื้อจัดอบรม Mini Course CPR &amp; AED ให้พนักงานของผู้เช่าซื้อ 5–7 ท่าน (2 ชั่วโมง) 1 ครั้งภายในอายุสัญญา ณ สถานที่ของผู้เช่าซื้อ (นอกกรุงเทพฯ ค่าเดินทางตามที่ระบุในใบเสนอราคา)</w:t>
+      </w:r>
+    </w:p>
+    <w:p>
+      <w:pPr>
         <w:keepNext/>
         <w:spacing w:after="80" w:before="200"/>
       </w:pPr>
@@ -1257,7 +1351,7 @@
           <w:sz w:val="32"/>
           <w:szCs w:val="32"/>
         </w:rPr>
-        <w:t xml:space="preserve">ยอมให้ผู้ให้เช่าซื้อหรือตัวแทนเข้าตรวจสภาพทรัพย์สิน แบตเตอรี่ และแผ่นอิเล็กโทรด ตามรอบทุก 6 เดือน และเมื่อผู้ให้เช่าซื้อเห็นสมควร ในเวลาทำการ โดยแจ้งล่วงหน้าไม่น้อยกว่า 3 วันทำการ โดยไม่มีค่าใช้จ่ายสำหรับการตรวจตามรอบ</w:t>
+        <w:t xml:space="preserve">ผู้ให้เช่าซื้อตรวจสอบสถานะแบตเตอรี่ แผ่นอิเล็กโทรด ความพร้อมใช้งาน และตำแหน่งของเครื่องผ่านระบบ GPS ออนไลน์ตลอดอายุสัญญาโดยไม่มีค่าใช้จ่าย และเข้าตรวจหน้างานเมื่อระบบแจ้งเตือนหรือเมื่อเห็นสมควร ในเวลาทำการ โดยแจ้งล่วงหน้าไม่น้อยกว่า 3 วันทำการ</w:t>
       </w:r>
     </w:p>
     <w:p>
@@ -1307,7 +1401,7 @@
           <w:sz w:val="32"/>
           <w:szCs w:val="32"/>
         </w:rPr>
-        <w:t xml:space="preserve">ไม่แกะ ปิดบัง หรือทำลายป้ายแสดงกรรมสิทธิ์และหมายเลขเครื่องตามข้อ 3.3 และไม่ดัดแปลงตัวเครื่อง</w:t>
+        <w:t xml:space="preserve">ไม่แกะ ปิดบัง หรือทำลายป้ายแสดงกรรมสิทธิ์และหมายเลขเครื่องตามข้อ 3.3 ไม่ถอด ปิด หรือดัดแปลงระบบ GPS และระบบตรวจสอบสถานะของเครื่อง และไม่ดัดแปลงตัวเครื่อง</w:t>
       </w:r>
     </w:p>
     <w:p>
@@ -1744,7 +1838,7 @@
           <w:sz w:val="32"/>
           <w:szCs w:val="32"/>
         </w:rPr>
-        <w:t xml:space="preserve">ผู้ให้เช่าซื้อจะเก็บรวบรวมและใช้ข้อมูลส่วนบุคคลของผู้แทนและผู้ประสานงานของผู้เช่าซื้อเท่าที่จำเป็นเพื่อปฏิบัติตามสัญญานี้ ออกเอกสารทางบัญชีและภาษี และติดต่อเรื่องการดูแลเครื่อง ตามพระราชบัญญัติคุ้มครองข้อมูลส่วนบุคคล พ.ศ. 2562</w:t>
+        <w:t xml:space="preserve">ผู้ให้เช่าซื้อจะเก็บรวบรวมและใช้ข้อมูลส่วนบุคคลของผู้แทนและผู้ประสานงานของผู้เช่าซื้อเท่าที่จำเป็นเพื่อปฏิบัติตามสัญญานี้ ออกเอกสารทางบัญชีและภาษี และติดต่อเรื่องการดูแลเครื่อง รวมถึงเก็บข้อมูลสถานะและตำแหน่งของตัวเครื่องจากระบบ GPS ตลอดอายุสัญญาเพื่อดูแลความพร้อมใช้งานและคุ้มครองกรรมสิทธิ์ (เป็นข้อมูลของตัวเครื่อง ไม่ใช่การติดตามบุคคล) ตามพระราชบัญญัติคุ้มครองข้อมูลส่วนบุคคล พ.ศ. 2562</w:t>
       </w:r>
     </w:p>
     <w:p>
@@ -2104,7 +2198,7 @@
           <w:sz w:val="32"/>
           <w:szCs w:val="32"/>
         </w:rPr>
-        <w:t xml:space="preserve">แนบท้ายสัญญาเช่าซื้อเลขที่ ________________  ทรัพย์สิน: Yuwell (PRIMEDIC HeartSave) Y8 พร้อมตู้  S/N ________________</w:t>
+        <w:t xml:space="preserve">แนบท้ายสัญญาเช่าซื้อเลขที่ ________________  ทรัพย์สิน: Yuwell (PRIMEDIC HeartSave) Y8 GPS พร้อมตู้  S/N ________________</w:t>
       </w:r>
     </w:p>
     <w:tbl>
@@ -5882,7 +5976,7 @@
                 <w:sz w:val="30"/>
                 <w:szCs w:val="30"/>
               </w:rPr>
-              <w:t xml:space="preserve">เครื่อง Yuwell (PRIMEDIC HeartSave) Y8</w:t>
+              <w:t xml:space="preserve">เครื่อง Yuwell (PRIMEDIC HeartSave) Y8 GPS</w:t>
             </w:r>
           </w:p>
         </w:tc>
@@ -6643,6 +6737,20 @@
           <w:szCs w:val="32"/>
         </w:rPr>
         <w:t xml:space="preserve">☐ เครื่องเปิดทดสอบตัวเองผ่าน ไฟสถานะแสดงพร้อมใช้งาน</w:t>
+      </w:r>
+    </w:p>
+    <w:p>
+      <w:pPr>
+        <w:spacing w:after="80" w:line="300"/>
+        <w:jc w:val="left"/>
+      </w:pPr>
+      <w:r>
+        <w:rPr>
+          <w:rFonts w:ascii="TH SarabunPSK" w:cs="TH SarabunPSK" w:eastAsia="TH SarabunPSK" w:hAnsi="TH SarabunPSK"/>
+          <w:sz w:val="32"/>
+          <w:szCs w:val="32"/>
+        </w:rPr>
+        <w:t xml:space="preserve">☐ ระบบ GPS แสดงตำแหน่งตรงกับจุดติดตั้ง และเชื่อมต่อระบบตรวจสอบสถานะแล้ว</w:t>
       </w:r>
     </w:p>
     <w:p>

</xml_diff>